<commit_message>
Update FYP proposal with project description and ethics checklist
</commit_message>
<xml_diff>
--- a/FYP Proposal P2321251Sun WenBin.docx
+++ b/FYP Proposal P2321251Sun WenBin.docx
@@ -168,7 +168,6 @@
         </w:rPr>
         <w:br/>
       </w:r>
-      <w:proofErr w:type="spellStart"/>
       <w:r>
         <w:rPr>
           <w:rFonts w:asciiTheme="minorHAnsi" w:hAnsiTheme="minorHAnsi"/>
@@ -177,7 +176,6 @@
         </w:rPr>
         <w:t>Project</w:t>
       </w:r>
-      <w:proofErr w:type="spellEnd"/>
       <w:r>
         <w:rPr>
           <w:rFonts w:asciiTheme="minorHAnsi" w:hAnsiTheme="minorHAnsi"/>
@@ -318,8 +316,17 @@
               <w:rPr>
                 <w:sz w:val="28"/>
                 <w:szCs w:val="28"/>
-              </w:rPr>
-              <w:t>Your project title</w:t>
+                <w:lang w:val="en-GB"/>
+              </w:rPr>
+              <w:t>A Low-Cost IoT Environmental Monitoring System for Server Rooms Using Raspberry Pi and DHT22 Sensors</w:t>
+            </w:r>
+            <w:r>
+              <w:rPr>
+                <w:sz w:val="28"/>
+                <w:szCs w:val="28"/>
+                <w:lang w:val="en-GB"/>
+              </w:rPr>
+              <w:t xml:space="preserve"> </w:t>
             </w:r>
           </w:p>
         </w:tc>
@@ -557,17 +564,33 @@
             <w:pPr>
               <w:pStyle w:val="NoSpacing"/>
               <w:rPr>
-                <w:rFonts w:eastAsiaTheme="minorEastAsia"/>
-                <w:lang w:eastAsia="zh-CN"/>
-              </w:rPr>
-            </w:pPr>
-            <w:r>
-              <w:rPr>
                 <w:rFonts w:eastAsiaTheme="minorEastAsia" w:hint="eastAsia"/>
                 <w:lang w:eastAsia="zh-CN"/>
               </w:rPr>
-              <w:t>SUN WENBIN</w:t>
-            </w:r>
+            </w:pPr>
+            <w:r>
+              <w:rPr>
+                <w:rFonts w:eastAsiaTheme="minorEastAsia" w:hint="eastAsia"/>
+                <w:lang w:eastAsia="zh-CN"/>
+              </w:rPr>
+              <w:t>S</w:t>
+            </w:r>
+            <w:r>
+              <w:rPr>
+                <w:rFonts w:eastAsiaTheme="minorEastAsia" w:hint="eastAsia"/>
+                <w:lang w:eastAsia="zh-CN"/>
+              </w:rPr>
+              <w:t xml:space="preserve">un </w:t>
+            </w:r>
+            <w:proofErr w:type="spellStart"/>
+            <w:r>
+              <w:rPr>
+                <w:rFonts w:eastAsiaTheme="minorEastAsia" w:hint="eastAsia"/>
+                <w:lang w:eastAsia="zh-CN"/>
+              </w:rPr>
+              <w:t>WenBin</w:t>
+            </w:r>
+            <w:proofErr w:type="spellEnd"/>
           </w:p>
         </w:tc>
       </w:tr>
@@ -827,7 +850,7 @@
     <w:p>
       <w:pPr>
         <w:rPr>
-          <w:rFonts w:eastAsiaTheme="minorEastAsia" w:hint="eastAsia"/>
+          <w:rFonts w:eastAsiaTheme="minorEastAsia"/>
           <w:lang w:eastAsia="zh-CN"/>
         </w:rPr>
       </w:pPr>
@@ -1041,7 +1064,7 @@
       <w:pPr>
         <w:pStyle w:val="BibItems"/>
         <w:rPr>
-          <w:rFonts w:eastAsiaTheme="minorEastAsia" w:hint="eastAsia"/>
+          <w:rFonts w:eastAsiaTheme="minorEastAsia"/>
           <w:lang w:eastAsia="zh-CN"/>
         </w:rPr>
       </w:pPr>
@@ -1069,7 +1092,7 @@
       <w:pPr>
         <w:pStyle w:val="BibItems"/>
         <w:rPr>
-          <w:rFonts w:eastAsiaTheme="minorEastAsia" w:hint="eastAsia"/>
+          <w:rFonts w:eastAsiaTheme="minorEastAsia"/>
           <w:lang w:eastAsia="zh-CN"/>
         </w:rPr>
       </w:pPr>
@@ -1081,7 +1104,7 @@
       <w:pPr>
         <w:pStyle w:val="BibItems"/>
         <w:rPr>
-          <w:rFonts w:eastAsiaTheme="minorEastAsia" w:hint="eastAsia"/>
+          <w:rFonts w:eastAsiaTheme="minorEastAsia"/>
           <w:lang w:eastAsia="zh-CN"/>
         </w:rPr>
       </w:pPr>
@@ -1109,7 +1132,7 @@
       <w:pPr>
         <w:pStyle w:val="BibItems"/>
         <w:rPr>
-          <w:rFonts w:eastAsiaTheme="minorEastAsia" w:hint="eastAsia"/>
+          <w:rFonts w:eastAsiaTheme="minorEastAsia"/>
           <w:lang w:eastAsia="zh-CN"/>
         </w:rPr>
       </w:pPr>
@@ -1129,7 +1152,7 @@
       <w:pPr>
         <w:pStyle w:val="BibItems"/>
         <w:rPr>
-          <w:rFonts w:eastAsiaTheme="minorEastAsia" w:hint="eastAsia"/>
+          <w:rFonts w:eastAsiaTheme="minorEastAsia"/>
           <w:lang w:eastAsia="zh-CN"/>
         </w:rPr>
       </w:pPr>
@@ -1141,7 +1164,7 @@
       <w:pPr>
         <w:pStyle w:val="BibItems"/>
         <w:rPr>
-          <w:rFonts w:eastAsiaTheme="minorEastAsia" w:hint="eastAsia"/>
+          <w:rFonts w:eastAsiaTheme="minorEastAsia"/>
           <w:lang w:eastAsia="zh-CN"/>
         </w:rPr>
       </w:pPr>
@@ -1153,7 +1176,7 @@
       <w:pPr>
         <w:pStyle w:val="BibItems"/>
         <w:rPr>
-          <w:rFonts w:eastAsiaTheme="minorEastAsia" w:hint="eastAsia"/>
+          <w:rFonts w:eastAsiaTheme="minorEastAsia"/>
           <w:lang w:eastAsia="zh-CN"/>
         </w:rPr>
       </w:pPr>
@@ -1165,7 +1188,7 @@
       <w:pPr>
         <w:pStyle w:val="BibItems"/>
         <w:rPr>
-          <w:rFonts w:eastAsiaTheme="minorEastAsia" w:hint="eastAsia"/>
+          <w:rFonts w:eastAsiaTheme="minorEastAsia"/>
           <w:lang w:eastAsia="zh-CN"/>
         </w:rPr>
       </w:pPr>
@@ -1177,7 +1200,7 @@
       <w:pPr>
         <w:pStyle w:val="BibItems"/>
         <w:rPr>
-          <w:rFonts w:eastAsiaTheme="minorEastAsia" w:hint="eastAsia"/>
+          <w:rFonts w:eastAsiaTheme="minorEastAsia"/>
           <w:lang w:eastAsia="zh-CN"/>
         </w:rPr>
       </w:pPr>
@@ -1189,7 +1212,7 @@
       <w:pPr>
         <w:pStyle w:val="BibItems"/>
         <w:rPr>
-          <w:rFonts w:eastAsiaTheme="minorEastAsia" w:hint="eastAsia"/>
+          <w:rFonts w:eastAsiaTheme="minorEastAsia"/>
           <w:lang w:eastAsia="zh-CN"/>
         </w:rPr>
       </w:pPr>
@@ -1298,7 +1321,27 @@
           <w:p>
             <w:pPr>
               <w:pStyle w:val="NoSpacing"/>
-            </w:pPr>
+              <w:rPr>
+                <w:rFonts w:eastAsiaTheme="minorEastAsia" w:hint="eastAsia"/>
+                <w:lang w:eastAsia="zh-CN"/>
+              </w:rPr>
+            </w:pPr>
+            <w:r>
+              <w:rPr>
+                <w:rFonts w:eastAsiaTheme="minorEastAsia" w:hint="eastAsia"/>
+                <w:lang w:eastAsia="zh-CN"/>
+              </w:rPr>
+              <w:t xml:space="preserve">Sun </w:t>
+            </w:r>
+            <w:proofErr w:type="spellStart"/>
+            <w:r>
+              <w:rPr>
+                <w:rFonts w:eastAsiaTheme="minorEastAsia" w:hint="eastAsia"/>
+                <w:lang w:eastAsia="zh-CN"/>
+              </w:rPr>
+              <w:t>WenBin</w:t>
+            </w:r>
+            <w:proofErr w:type="spellEnd"/>
           </w:p>
         </w:tc>
       </w:tr>
@@ -1335,7 +1378,18 @@
           <w:p>
             <w:pPr>
               <w:pStyle w:val="NoSpacing"/>
-            </w:pPr>
+              <w:rPr>
+                <w:rFonts w:eastAsiaTheme="minorEastAsia" w:hint="eastAsia"/>
+                <w:lang w:eastAsia="zh-CN"/>
+              </w:rPr>
+            </w:pPr>
+            <w:r>
+              <w:rPr>
+                <w:rFonts w:eastAsiaTheme="minorEastAsia" w:hint="eastAsia"/>
+                <w:lang w:eastAsia="zh-CN"/>
+              </w:rPr>
+              <w:t>P2321251</w:t>
+            </w:r>
           </w:p>
         </w:tc>
       </w:tr>
@@ -1369,7 +1423,7 @@
               <w:pStyle w:val="NoSpacing"/>
             </w:pPr>
             <w:r>
-              <w:sym w:font="Wingdings" w:char="F06F"/>
+              <w:sym w:font="Wingdings" w:char="F0FE"/>
             </w:r>
             <w:r>
               <w:t xml:space="preserve"> </w:t>
@@ -1481,12 +1535,17 @@
           <w:p>
             <w:pPr>
               <w:pStyle w:val="NoSpacing"/>
-            </w:pPr>
-          </w:p>
-          <w:p>
-            <w:pPr>
-              <w:pStyle w:val="NoSpacing"/>
-            </w:pPr>
+              <w:rPr>
+                <w:rFonts w:eastAsiaTheme="minorEastAsia" w:hint="eastAsia"/>
+                <w:lang w:eastAsia="zh-CN"/>
+              </w:rPr>
+            </w:pPr>
+            <w:r>
+              <w:rPr>
+                <w:lang w:val="en-GB"/>
+              </w:rPr>
+              <w:t>A Low-Cost IoT Environmental Monitoring System for Server Rooms Using Raspberry Pi and DHT22 Sensors</w:t>
+            </w:r>
           </w:p>
         </w:tc>
       </w:tr>
@@ -1519,10 +1578,21 @@
             <w:pPr>
               <w:pStyle w:val="NoSpacing"/>
             </w:pPr>
-          </w:p>
-          <w:p>
-            <w:pPr>
-              <w:pStyle w:val="NoSpacing"/>
+            <w:r>
+              <w:rPr>
+                <w:rFonts w:ascii="Calibri" w:hAnsi="Calibri" w:cs="Calibri"/>
+                <w:color w:val="000000"/>
+              </w:rPr>
+              <w:t>Tang Su Kit Jacky</w:t>
+            </w:r>
+          </w:p>
+          <w:p>
+            <w:pPr>
+              <w:pStyle w:val="NoSpacing"/>
+              <w:rPr>
+                <w:rFonts w:eastAsiaTheme="minorEastAsia" w:hint="eastAsia"/>
+                <w:lang w:eastAsia="zh-CN"/>
+              </w:rPr>
             </w:pPr>
           </w:p>
         </w:tc>
@@ -1589,16 +1659,56 @@
           </w:tcPr>
           <w:p>
             <w:pPr>
-              <w:pStyle w:val="NoSpacing"/>
-            </w:pPr>
-            <w:r>
-              <w:t>Please provide more information on your project/dissertation proposal below (100-200 words).</w:t>
-            </w:r>
-          </w:p>
-          <w:p>
-            <w:pPr>
-              <w:pStyle w:val="NoSpacing"/>
-            </w:pPr>
+              <w:rPr>
+                <w:rFonts w:eastAsiaTheme="minorEastAsia" w:cstheme="minorHAnsi" w:hint="eastAsia"/>
+                <w:szCs w:val="22"/>
+                <w:lang w:val="en-US" w:eastAsia="zh-CN"/>
+              </w:rPr>
+            </w:pPr>
+            <w:r>
+              <w:rPr>
+                <w:rFonts w:cstheme="minorHAnsi"/>
+                <w:szCs w:val="22"/>
+                <w:lang w:val="en-US"/>
+              </w:rPr>
+              <w:t xml:space="preserve">This project </w:t>
+            </w:r>
+            <w:proofErr w:type="gramStart"/>
+            <w:r>
+              <w:rPr>
+                <w:rFonts w:cstheme="minorHAnsi"/>
+                <w:szCs w:val="22"/>
+                <w:lang w:val="en-US"/>
+              </w:rPr>
+              <w:t>designs</w:t>
+            </w:r>
+            <w:proofErr w:type="gramEnd"/>
+            <w:r>
+              <w:rPr>
+                <w:rFonts w:cstheme="minorHAnsi"/>
+                <w:szCs w:val="22"/>
+                <w:lang w:val="en-US"/>
+              </w:rPr>
+              <w:t xml:space="preserve"> and builds a low-cost, real-time environmental monitoring system for server rooms. Raspberry Pi sensor nodes equipped with DHT22 sensors continuously measure temperature (±0.5 °C accuracy) and humidity (±2 % RH accuracy) at 1-minute intervals and transmit the readings to a central Flask server, where the data is stored in a SQLite database. An interactive web dashboard built with Chart.js and Bootstrap displays real-time gauges and 24-hour trend charts. Configurable threshold alerts send instant Telegram notifications when temperature or humidity exceeds safe limits, and historical data can be exported as CSV for compliance reporting. As an extension, a Spark and Hive batch-processing layer aggregates readings for longer-term trend analysis. The project targets a ≥99 % data capture rate over a 7-day test period, page refresh under 2 seconds, alerts within 10 seconds of a threshold breach, and 30-day </w:t>
+            </w:r>
+            <w:proofErr w:type="gramStart"/>
+            <w:r>
+              <w:rPr>
+                <w:rFonts w:cstheme="minorHAnsi"/>
+                <w:szCs w:val="22"/>
+                <w:lang w:val="en-US"/>
+              </w:rPr>
+              <w:t>queries in</w:t>
+            </w:r>
+            <w:proofErr w:type="gramEnd"/>
+            <w:r>
+              <w:rPr>
+                <w:rFonts w:cstheme="minorHAnsi"/>
+                <w:szCs w:val="22"/>
+                <w:lang w:val="en-US"/>
+              </w:rPr>
+              <w:t xml:space="preserve"> under 1 second.</w:t>
+            </w:r>
           </w:p>
         </w:tc>
       </w:tr>
@@ -1615,13 +1725,6 @@
         </w:rPr>
         <w:br w:type="page"/>
       </w:r>
-    </w:p>
-    <w:p>
-      <w:pPr>
-        <w:rPr>
-          <w:b/>
-        </w:rPr>
-      </w:pPr>
       <w:r>
         <w:rPr>
           <w:b/>
@@ -1785,6 +1888,23 @@
           <w:p>
             <w:pPr>
               <w:pStyle w:val="NoSpacing"/>
+              <w:rPr>
+                <w:b/>
+                <w:bCs/>
+              </w:rPr>
+            </w:pPr>
+            <w:r>
+              <w:rPr>
+                <w:rFonts w:ascii="Segoe UI Symbol" w:hAnsi="Segoe UI Symbol" w:cs="Segoe UI Symbol"/>
+                <w:b/>
+                <w:bCs/>
+              </w:rPr>
+              <w:t>✓</w:t>
+            </w:r>
+          </w:p>
+          <w:p>
+            <w:pPr>
+              <w:pStyle w:val="NoSpacing"/>
             </w:pPr>
           </w:p>
         </w:tc>
@@ -1867,6 +1987,23 @@
           <w:p>
             <w:pPr>
               <w:pStyle w:val="NoSpacing"/>
+              <w:rPr>
+                <w:b/>
+                <w:bCs/>
+              </w:rPr>
+            </w:pPr>
+            <w:r>
+              <w:rPr>
+                <w:rFonts w:ascii="Segoe UI Symbol" w:hAnsi="Segoe UI Symbol" w:cs="Segoe UI Symbol"/>
+                <w:b/>
+                <w:bCs/>
+              </w:rPr>
+              <w:t>✓</w:t>
+            </w:r>
+          </w:p>
+          <w:p>
+            <w:pPr>
+              <w:pStyle w:val="NoSpacing"/>
             </w:pPr>
           </w:p>
         </w:tc>
@@ -1926,7 +2063,21 @@
           <w:p>
             <w:pPr>
               <w:pStyle w:val="NoSpacing"/>
-            </w:pPr>
+              <w:rPr>
+                <w:rFonts w:eastAsiaTheme="minorEastAsia" w:hint="eastAsia"/>
+                <w:b/>
+                <w:bCs/>
+                <w:lang w:eastAsia="zh-CN"/>
+              </w:rPr>
+            </w:pPr>
+            <w:r>
+              <w:rPr>
+                <w:rFonts w:ascii="Segoe UI Symbol" w:hAnsi="Segoe UI Symbol" w:cs="Segoe UI Symbol"/>
+                <w:b/>
+                <w:bCs/>
+              </w:rPr>
+              <w:t>✓</w:t>
+            </w:r>
           </w:p>
         </w:tc>
       </w:tr>
@@ -1985,7 +2136,21 @@
           <w:p>
             <w:pPr>
               <w:pStyle w:val="NoSpacing"/>
-            </w:pPr>
+              <w:rPr>
+                <w:rFonts w:eastAsiaTheme="minorEastAsia" w:hint="eastAsia"/>
+                <w:b/>
+                <w:bCs/>
+                <w:lang w:eastAsia="zh-CN"/>
+              </w:rPr>
+            </w:pPr>
+            <w:r>
+              <w:rPr>
+                <w:rFonts w:ascii="Segoe UI Symbol" w:hAnsi="Segoe UI Symbol" w:cs="Segoe UI Symbol"/>
+                <w:b/>
+                <w:bCs/>
+              </w:rPr>
+              <w:t>✓</w:t>
+            </w:r>
           </w:p>
         </w:tc>
       </w:tr>
@@ -2044,7 +2209,21 @@
           <w:p>
             <w:pPr>
               <w:pStyle w:val="NoSpacing"/>
-            </w:pPr>
+              <w:rPr>
+                <w:rFonts w:eastAsiaTheme="minorEastAsia" w:hint="eastAsia"/>
+                <w:b/>
+                <w:bCs/>
+                <w:lang w:eastAsia="zh-CN"/>
+              </w:rPr>
+            </w:pPr>
+            <w:r>
+              <w:rPr>
+                <w:rFonts w:ascii="Segoe UI Symbol" w:hAnsi="Segoe UI Symbol" w:cs="Segoe UI Symbol"/>
+                <w:b/>
+                <w:bCs/>
+              </w:rPr>
+              <w:t>✓</w:t>
+            </w:r>
           </w:p>
         </w:tc>
       </w:tr>
@@ -2100,6 +2279,23 @@
           <w:tcPr>
             <w:tcW w:w="805" w:type="dxa"/>
           </w:tcPr>
+          <w:p>
+            <w:pPr>
+              <w:pStyle w:val="NoSpacing"/>
+              <w:rPr>
+                <w:b/>
+                <w:bCs/>
+              </w:rPr>
+            </w:pPr>
+            <w:r>
+              <w:rPr>
+                <w:rFonts w:ascii="Segoe UI Symbol" w:hAnsi="Segoe UI Symbol" w:cs="Segoe UI Symbol"/>
+                <w:b/>
+                <w:bCs/>
+              </w:rPr>
+              <w:t>✓</w:t>
+            </w:r>
+          </w:p>
           <w:p>
             <w:pPr>
               <w:pStyle w:val="NoSpacing"/>
@@ -2259,6 +2455,23 @@
           <w:p>
             <w:pPr>
               <w:pStyle w:val="NoSpacing"/>
+              <w:rPr>
+                <w:b/>
+                <w:bCs/>
+              </w:rPr>
+            </w:pPr>
+            <w:r>
+              <w:rPr>
+                <w:rFonts w:ascii="Segoe UI Symbol" w:hAnsi="Segoe UI Symbol" w:cs="Segoe UI Symbol"/>
+                <w:b/>
+                <w:bCs/>
+              </w:rPr>
+              <w:t>✓</w:t>
+            </w:r>
+          </w:p>
+          <w:p>
+            <w:pPr>
+              <w:pStyle w:val="NoSpacing"/>
             </w:pPr>
           </w:p>
         </w:tc>
@@ -2316,6 +2529,23 @@
             <w:tcW w:w="810" w:type="dxa"/>
             <w:shd w:val="clear" w:color="auto" w:fill="FFFFFF" w:themeFill="background1"/>
           </w:tcPr>
+          <w:p>
+            <w:pPr>
+              <w:pStyle w:val="NoSpacing"/>
+              <w:rPr>
+                <w:b/>
+                <w:bCs/>
+              </w:rPr>
+            </w:pPr>
+            <w:r>
+              <w:rPr>
+                <w:rFonts w:ascii="Segoe UI Symbol" w:hAnsi="Segoe UI Symbol" w:cs="Segoe UI Symbol"/>
+                <w:b/>
+                <w:bCs/>
+              </w:rPr>
+              <w:t>✓</w:t>
+            </w:r>
+          </w:p>
           <w:p>
             <w:pPr>
               <w:pStyle w:val="NoSpacing"/>
@@ -2485,6 +2715,23 @@
           <w:p>
             <w:pPr>
               <w:pStyle w:val="NoSpacing"/>
+              <w:rPr>
+                <w:b/>
+                <w:bCs/>
+              </w:rPr>
+            </w:pPr>
+            <w:r>
+              <w:rPr>
+                <w:rFonts w:ascii="Segoe UI Symbol" w:hAnsi="Segoe UI Symbol" w:cs="Segoe UI Symbol"/>
+                <w:b/>
+                <w:bCs/>
+              </w:rPr>
+              <w:t>✓</w:t>
+            </w:r>
+          </w:p>
+          <w:p>
+            <w:pPr>
+              <w:pStyle w:val="NoSpacing"/>
             </w:pPr>
           </w:p>
         </w:tc>
@@ -2542,6 +2789,23 @@
             <w:tcW w:w="810" w:type="dxa"/>
             <w:shd w:val="clear" w:color="auto" w:fill="FFFFFF" w:themeFill="background1"/>
           </w:tcPr>
+          <w:p>
+            <w:pPr>
+              <w:pStyle w:val="NoSpacing"/>
+              <w:rPr>
+                <w:b/>
+                <w:bCs/>
+              </w:rPr>
+            </w:pPr>
+            <w:r>
+              <w:rPr>
+                <w:rFonts w:ascii="Segoe UI Symbol" w:hAnsi="Segoe UI Symbol" w:cs="Segoe UI Symbol"/>
+                <w:b/>
+                <w:bCs/>
+              </w:rPr>
+              <w:t>✓</w:t>
+            </w:r>
+          </w:p>
           <w:p>
             <w:pPr>
               <w:pStyle w:val="NoSpacing"/>
@@ -2584,14 +2848,24 @@
               <w:pStyle w:val="NoSpacing"/>
             </w:pPr>
             <w:r>
+              <w:rPr>
+                <w:lang w:val="en-GB"/>
+              </w:rPr>
               <w:lastRenderedPageBreak/>
-              <w:t>Please explain how the identified potential research ethics issue will be handled.</w:t>
-            </w:r>
-          </w:p>
-          <w:p>
-            <w:pPr>
-              <w:pStyle w:val="NoSpacing"/>
-            </w:pPr>
+              <w:t xml:space="preserve">No ethical issues are identified. The project monitors only physical environmental variables (temperature and humidity) in a server room. It involves no human participants, no personal or </w:t>
+            </w:r>
+            <w:r>
+              <w:rPr>
+                <w:lang w:val="en-GB"/>
+              </w:rPr>
+              <w:t>anonym sable</w:t>
+            </w:r>
+            <w:r>
+              <w:rPr>
+                <w:lang w:val="en-GB"/>
+              </w:rPr>
+              <w:t xml:space="preserve"> data, and no activities that pose risks beyond ordinary study or working life.</w:t>
+            </w:r>
           </w:p>
           <w:p>
             <w:pPr>
@@ -2716,7 +2990,27 @@
           <w:p>
             <w:pPr>
               <w:pStyle w:val="NoSpacing"/>
-            </w:pPr>
+              <w:rPr>
+                <w:rFonts w:eastAsiaTheme="minorEastAsia" w:hint="eastAsia"/>
+                <w:lang w:eastAsia="zh-CN"/>
+              </w:rPr>
+            </w:pPr>
+            <w:r>
+              <w:rPr>
+                <w:rFonts w:eastAsiaTheme="minorEastAsia" w:hint="eastAsia"/>
+                <w:lang w:eastAsia="zh-CN"/>
+              </w:rPr>
+              <w:t xml:space="preserve">Sun </w:t>
+            </w:r>
+            <w:proofErr w:type="spellStart"/>
+            <w:r>
+              <w:rPr>
+                <w:rFonts w:eastAsiaTheme="minorEastAsia" w:hint="eastAsia"/>
+                <w:lang w:eastAsia="zh-CN"/>
+              </w:rPr>
+              <w:t>WenBin</w:t>
+            </w:r>
+            <w:proofErr w:type="spellEnd"/>
           </w:p>
           <w:p>
             <w:pPr>
@@ -6908,7 +7202,6 @@
   <w:style w:type="character" w:default="1" w:styleId="DefaultParagraphFont">
     <w:name w:val="Default Paragraph Font"/>
     <w:uiPriority w:val="1"/>
-    <w:semiHidden/>
     <w:unhideWhenUsed/>
   </w:style>
   <w:style w:type="table" w:default="1" w:styleId="TableNormal">

</xml_diff>

<commit_message>
Complete proposal schedule and risk assessment sections
</commit_message>
<xml_diff>
--- a/FYP Proposal P2321251Sun WenBin.docx
+++ b/FYP Proposal P2321251Sun WenBin.docx
@@ -318,15 +318,7 @@
                 <w:szCs w:val="28"/>
                 <w:lang w:val="en-GB"/>
               </w:rPr>
-              <w:t>A Low-Cost IoT Environmental Monitoring System for Server Rooms Using Raspberry Pi and DHT22 Sensors</w:t>
-            </w:r>
-            <w:r>
-              <w:rPr>
-                <w:sz w:val="28"/>
-                <w:szCs w:val="28"/>
-                <w:lang w:val="en-GB"/>
-              </w:rPr>
-              <w:t xml:space="preserve"> </w:t>
+              <w:t xml:space="preserve">A Low-Cost IoT Environmental Monitoring System for Server Rooms Using Raspberry Pi and DHT22 Sensors </w:t>
             </w:r>
           </w:p>
         </w:tc>
@@ -564,7 +556,7 @@
             <w:pPr>
               <w:pStyle w:val="NoSpacing"/>
               <w:rPr>
-                <w:rFonts w:eastAsiaTheme="minorEastAsia" w:hint="eastAsia"/>
+                <w:rFonts w:eastAsiaTheme="minorEastAsia"/>
                 <w:lang w:eastAsia="zh-CN"/>
               </w:rPr>
             </w:pPr>
@@ -1006,56 +998,2040 @@
     </w:p>
     <w:p>
       <w:r>
-        <w:t xml:space="preserve">This section gives a tentative schedule of how the project work is to be accomplished. </w:t>
-      </w:r>
-      <w:r>
-        <w:t xml:space="preserve">Break down the major </w:t>
-      </w:r>
-      <w:r>
-        <w:t xml:space="preserve">activities in the yearly project. </w:t>
-      </w:r>
-      <w:r>
-        <w:t xml:space="preserve">Key deliverables (such as key outputs, reports or presentations) should be stated in the schedule. </w:t>
-      </w:r>
-      <w:r>
-        <w:t>Follow the content requirement of Chapter 5 of the Final Report. For the proposal, the minimum requirement is the Activity List.</w:t>
+        <w:t>The schedule below follows the official FYP calendar. All major deliverables are aligned to the stated submission deadlines. Activities A9 and A10 run in parallel and are completed before Week 6 of the second semester (25 Feb). The Final Presentation and Poster Presentation take place in Week 10 (Mar). The Final Report, demo video and optional conference-ready manuscript are submitted in Week 13 (15 Apr).</w:t>
+      </w:r>
+    </w:p>
+    <w:tbl>
+      <w:tblPr>
+        <w:tblStyle w:val="TableGrid"/>
+        <w:tblW w:w="0" w:type="auto"/>
+        <w:tblInd w:w="108" w:type="dxa"/>
+        <w:tblLayout w:type="fixed"/>
+        <w:tblLook w:val="04A0" w:firstRow="1" w:lastRow="0" w:firstColumn="1" w:lastColumn="0" w:noHBand="0" w:noVBand="1"/>
+      </w:tblPr>
+      <w:tblGrid>
+        <w:gridCol w:w="1134"/>
+        <w:gridCol w:w="4314"/>
+        <w:gridCol w:w="1587"/>
+        <w:gridCol w:w="1612"/>
+      </w:tblGrid>
+      <w:tr>
+        <w:tc>
+          <w:tcPr>
+            <w:tcW w:w="1134" w:type="dxa"/>
+            <w:shd w:val="clear" w:color="auto" w:fill="D9D9D9"/>
+          </w:tcPr>
+          <w:p>
+            <w:r>
+              <w:rPr>
+                <w:b/>
+              </w:rPr>
+              <w:t>Activity</w:t>
+            </w:r>
+          </w:p>
+        </w:tc>
+        <w:tc>
+          <w:tcPr>
+            <w:tcW w:w="4314" w:type="dxa"/>
+            <w:shd w:val="clear" w:color="auto" w:fill="D9D9D9"/>
+          </w:tcPr>
+          <w:p>
+            <w:pPr>
+              <w:ind w:firstLineChars="600" w:firstLine="1321"/>
+            </w:pPr>
+            <w:r>
+              <w:rPr>
+                <w:b/>
+              </w:rPr>
+              <w:t>Description</w:t>
+            </w:r>
+          </w:p>
+        </w:tc>
+        <w:tc>
+          <w:tcPr>
+            <w:tcW w:w="1587" w:type="dxa"/>
+            <w:shd w:val="clear" w:color="auto" w:fill="D9D9D9"/>
+          </w:tcPr>
+          <w:p>
+            <w:pPr>
+              <w:ind w:firstLineChars="100" w:firstLine="220"/>
+            </w:pPr>
+            <w:r>
+              <w:rPr>
+                <w:b/>
+              </w:rPr>
+              <w:t>Duration</w:t>
+            </w:r>
+          </w:p>
+        </w:tc>
+        <w:tc>
+          <w:tcPr>
+            <w:tcW w:w="1612" w:type="dxa"/>
+            <w:shd w:val="clear" w:color="auto" w:fill="D9D9D9"/>
+          </w:tcPr>
+          <w:p>
+            <w:r>
+              <w:rPr>
+                <w:b/>
+              </w:rPr>
+              <w:t>Predecessor</w:t>
+            </w:r>
+          </w:p>
+        </w:tc>
+      </w:tr>
+      <w:tr>
+        <w:tc>
+          <w:tcPr>
+            <w:tcW w:w="1134" w:type="dxa"/>
+          </w:tcPr>
+          <w:p>
+            <w:r>
+              <w:t>A1</w:t>
+            </w:r>
+          </w:p>
+        </w:tc>
+        <w:tc>
+          <w:tcPr>
+            <w:tcW w:w="4314" w:type="dxa"/>
+          </w:tcPr>
+          <w:p>
+            <w:r>
+              <w:t>Literature review and requirements analysis</w:t>
+            </w:r>
+          </w:p>
+        </w:tc>
+        <w:tc>
+          <w:tcPr>
+            <w:tcW w:w="1587" w:type="dxa"/>
+          </w:tcPr>
+          <w:p>
+            <w:r>
+              <w:t>3 wks (W1-3)</w:t>
+            </w:r>
+          </w:p>
+        </w:tc>
+        <w:tc>
+          <w:tcPr>
+            <w:tcW w:w="1612" w:type="dxa"/>
+          </w:tcPr>
+          <w:p>
+            <w:r>
+              <w:t>-</w:t>
+            </w:r>
+          </w:p>
+        </w:tc>
+      </w:tr>
+      <w:tr>
+        <w:tc>
+          <w:tcPr>
+            <w:tcW w:w="1134" w:type="dxa"/>
+          </w:tcPr>
+          <w:p>
+            <w:r>
+              <w:t>A2</w:t>
+            </w:r>
+          </w:p>
+        </w:tc>
+        <w:tc>
+          <w:tcPr>
+            <w:tcW w:w="4314" w:type="dxa"/>
+          </w:tcPr>
+          <w:p>
+            <w:r>
+              <w:t>Project planning; write Chapter 3 of Progress Report</w:t>
+            </w:r>
+          </w:p>
+        </w:tc>
+        <w:tc>
+          <w:tcPr>
+            <w:tcW w:w="1587" w:type="dxa"/>
+          </w:tcPr>
+          <w:p>
+            <w:r>
+              <w:t>1 wk (W5)</w:t>
+            </w:r>
+          </w:p>
+        </w:tc>
+        <w:tc>
+          <w:tcPr>
+            <w:tcW w:w="1612" w:type="dxa"/>
+          </w:tcPr>
+          <w:p>
+            <w:r>
+              <w:t>A1</w:t>
+            </w:r>
+          </w:p>
+        </w:tc>
+      </w:tr>
+      <w:tr>
+        <w:tc>
+          <w:tcPr>
+            <w:tcW w:w="1134" w:type="dxa"/>
+          </w:tcPr>
+          <w:p>
+            <w:r>
+              <w:t>A3</w:t>
+            </w:r>
+          </w:p>
+        </w:tc>
+        <w:tc>
+          <w:tcPr>
+            <w:tcW w:w="4314" w:type="dxa"/>
+          </w:tcPr>
+          <w:p>
+            <w:r>
+              <w:t>Proposal and ethics form submission</w:t>
+            </w:r>
+          </w:p>
+        </w:tc>
+        <w:tc>
+          <w:tcPr>
+            <w:tcW w:w="1587" w:type="dxa"/>
+          </w:tcPr>
+          <w:p>
+            <w:r>
+              <w:t>2 wks (by 10 Sep)</w:t>
+            </w:r>
+          </w:p>
+        </w:tc>
+        <w:tc>
+          <w:tcPr>
+            <w:tcW w:w="1612" w:type="dxa"/>
+          </w:tcPr>
+          <w:p>
+            <w:r>
+              <w:t>A1</w:t>
+            </w:r>
+          </w:p>
+        </w:tc>
+      </w:tr>
+      <w:tr>
+        <w:tc>
+          <w:tcPr>
+            <w:tcW w:w="1134" w:type="dxa"/>
+          </w:tcPr>
+          <w:p>
+            <w:r>
+              <w:t>A4</w:t>
+            </w:r>
+          </w:p>
+        </w:tc>
+        <w:tc>
+          <w:tcPr>
+            <w:tcW w:w="4314" w:type="dxa"/>
+          </w:tcPr>
+          <w:p>
+            <w:r>
+              <w:t>Hardware setup: Raspberry Pi + DHT22, sensor script and calibration</w:t>
+            </w:r>
+          </w:p>
+        </w:tc>
+        <w:tc>
+          <w:tcPr>
+            <w:tcW w:w="1587" w:type="dxa"/>
+          </w:tcPr>
+          <w:p>
+            <w:r>
+              <w:t>4 wks (W6-9)</w:t>
+            </w:r>
+          </w:p>
+        </w:tc>
+        <w:tc>
+          <w:tcPr>
+            <w:tcW w:w="1612" w:type="dxa"/>
+          </w:tcPr>
+          <w:p>
+            <w:r>
+              <w:t>A1, A3</w:t>
+            </w:r>
+          </w:p>
+        </w:tc>
+      </w:tr>
+      <w:tr>
+        <w:tc>
+          <w:tcPr>
+            <w:tcW w:w="1134" w:type="dxa"/>
+          </w:tcPr>
+          <w:p>
+            <w:r>
+              <w:t>A5</w:t>
+            </w:r>
+          </w:p>
+        </w:tc>
+        <w:tc>
+          <w:tcPr>
+            <w:tcW w:w="4314" w:type="dxa"/>
+          </w:tcPr>
+          <w:p>
+            <w:r>
+              <w:t xml:space="preserve">Backend development: Flask ingestion API, SQLite persistence, threshold checking, </w:t>
+            </w:r>
+            <w:r>
+              <w:lastRenderedPageBreak/>
+              <w:t>Telegram alerts</w:t>
+            </w:r>
+          </w:p>
+        </w:tc>
+        <w:tc>
+          <w:tcPr>
+            <w:tcW w:w="1587" w:type="dxa"/>
+          </w:tcPr>
+          <w:p>
+            <w:r>
+              <w:lastRenderedPageBreak/>
+              <w:t>4 wks (W9-12)</w:t>
+            </w:r>
+          </w:p>
+        </w:tc>
+        <w:tc>
+          <w:tcPr>
+            <w:tcW w:w="1612" w:type="dxa"/>
+          </w:tcPr>
+          <w:p>
+            <w:r>
+              <w:t>A4</w:t>
+            </w:r>
+          </w:p>
+        </w:tc>
+      </w:tr>
+      <w:tr>
+        <w:tc>
+          <w:tcPr>
+            <w:tcW w:w="1134" w:type="dxa"/>
+          </w:tcPr>
+          <w:p>
+            <w:r>
+              <w:t>A6</w:t>
+            </w:r>
+          </w:p>
+        </w:tc>
+        <w:tc>
+          <w:tcPr>
+            <w:tcW w:w="4314" w:type="dxa"/>
+          </w:tcPr>
+          <w:p>
+            <w:r>
+              <w:t>Progress Report submission and presentation</w:t>
+            </w:r>
+          </w:p>
+        </w:tc>
+        <w:tc>
+          <w:tcPr>
+            <w:tcW w:w="1587" w:type="dxa"/>
+          </w:tcPr>
+          <w:p>
+            <w:r>
+              <w:t>2 wks (W12-13)</w:t>
+            </w:r>
+          </w:p>
+        </w:tc>
+        <w:tc>
+          <w:tcPr>
+            <w:tcW w:w="1612" w:type="dxa"/>
+          </w:tcPr>
+          <w:p>
+            <w:r>
+              <w:t>A2, A5</w:t>
+            </w:r>
+          </w:p>
+        </w:tc>
+      </w:tr>
+      <w:tr>
+        <w:tc>
+          <w:tcPr>
+            <w:tcW w:w="1134" w:type="dxa"/>
+          </w:tcPr>
+          <w:p>
+            <w:r>
+              <w:t>A7</w:t>
+            </w:r>
+          </w:p>
+        </w:tc>
+        <w:tc>
+          <w:tcPr>
+            <w:tcW w:w="4314" w:type="dxa"/>
+          </w:tcPr>
+          <w:p>
+            <w:r>
+              <w:t>Dashboard development: Chart.js real-time gauges, 24-hour trends, CSV export</w:t>
+            </w:r>
+          </w:p>
+        </w:tc>
+        <w:tc>
+          <w:tcPr>
+            <w:tcW w:w="1587" w:type="dxa"/>
+          </w:tcPr>
+          <w:p>
+            <w:r>
+              <w:t>2 wks (W14-15)</w:t>
+            </w:r>
+          </w:p>
+        </w:tc>
+        <w:tc>
+          <w:tcPr>
+            <w:tcW w:w="1612" w:type="dxa"/>
+          </w:tcPr>
+          <w:p>
+            <w:r>
+              <w:t>A5</w:t>
+            </w:r>
+          </w:p>
+        </w:tc>
+      </w:tr>
+      <w:tr>
+        <w:tc>
+          <w:tcPr>
+            <w:tcW w:w="1134" w:type="dxa"/>
+          </w:tcPr>
+          <w:p>
+            <w:r>
+              <w:t>A8</w:t>
+            </w:r>
+          </w:p>
+        </w:tc>
+        <w:tc>
+          <w:tcPr>
+            <w:tcW w:w="4314" w:type="dxa"/>
+          </w:tcPr>
+          <w:p>
+            <w:r>
+              <w:t>Address supervisor/assessor comments on Progress Report</w:t>
+            </w:r>
+          </w:p>
+        </w:tc>
+        <w:tc>
+          <w:tcPr>
+            <w:tcW w:w="1587" w:type="dxa"/>
+          </w:tcPr>
+          <w:p>
+            <w:r>
+              <w:t>1 wk (W15)</w:t>
+            </w:r>
+          </w:p>
+        </w:tc>
+        <w:tc>
+          <w:tcPr>
+            <w:tcW w:w="1612" w:type="dxa"/>
+          </w:tcPr>
+          <w:p>
+            <w:r>
+              <w:t>A6</w:t>
+            </w:r>
+          </w:p>
+        </w:tc>
+      </w:tr>
+      <w:tr>
+        <w:tc>
+          <w:tcPr>
+            <w:tcW w:w="1134" w:type="dxa"/>
+          </w:tcPr>
+          <w:p>
+            <w:r>
+              <w:t>A9</w:t>
+            </w:r>
+          </w:p>
+        </w:tc>
+        <w:tc>
+          <w:tcPr>
+            <w:tcW w:w="4314" w:type="dxa"/>
+          </w:tcPr>
+          <w:p>
+            <w:r>
+              <w:t>System integration, 7-day continuous test, SMART-objective validation</w:t>
+            </w:r>
+          </w:p>
+        </w:tc>
+        <w:tc>
+          <w:tcPr>
+            <w:tcW w:w="1587" w:type="dxa"/>
+          </w:tcPr>
+          <w:p>
+            <w:r>
+              <w:t>6 wks (S2 W1-6)</w:t>
+            </w:r>
+          </w:p>
+        </w:tc>
+        <w:tc>
+          <w:tcPr>
+            <w:tcW w:w="1612" w:type="dxa"/>
+          </w:tcPr>
+          <w:p>
+            <w:r>
+              <w:t>A7, A8</w:t>
+            </w:r>
+          </w:p>
+        </w:tc>
+      </w:tr>
+      <w:tr>
+        <w:tc>
+          <w:tcPr>
+            <w:tcW w:w="1134" w:type="dxa"/>
+          </w:tcPr>
+          <w:p>
+            <w:r>
+              <w:t>A10</w:t>
+            </w:r>
+          </w:p>
+        </w:tc>
+        <w:tc>
+          <w:tcPr>
+            <w:tcW w:w="4314" w:type="dxa"/>
+          </w:tcPr>
+          <w:p>
+            <w:r>
+              <w:t>Spark/Hive batch layer (extension): Hive tables, PySpark aggregation job</w:t>
+            </w:r>
+          </w:p>
+        </w:tc>
+        <w:tc>
+          <w:tcPr>
+            <w:tcW w:w="1587" w:type="dxa"/>
+          </w:tcPr>
+          <w:p>
+            <w:r>
+              <w:t>3 wks (S2 W3-5)</w:t>
+            </w:r>
+          </w:p>
+        </w:tc>
+        <w:tc>
+          <w:tcPr>
+            <w:tcW w:w="1612" w:type="dxa"/>
+          </w:tcPr>
+          <w:p>
+            <w:r>
+              <w:t>A7, A8</w:t>
+            </w:r>
+          </w:p>
+        </w:tc>
+      </w:tr>
+      <w:tr>
+        <w:tc>
+          <w:tcPr>
+            <w:tcW w:w="1134" w:type="dxa"/>
+          </w:tcPr>
+          <w:p>
+            <w:r>
+              <w:t>A11</w:t>
+            </w:r>
+          </w:p>
+        </w:tc>
+        <w:tc>
+          <w:tcPr>
+            <w:tcW w:w="4314" w:type="dxa"/>
+          </w:tcPr>
+          <w:p>
+            <w:r>
+              <w:t>Final Report draft submission</w:t>
+            </w:r>
+          </w:p>
+        </w:tc>
+        <w:tc>
+          <w:tcPr>
+            <w:tcW w:w="1587" w:type="dxa"/>
+          </w:tcPr>
+          <w:p>
+            <w:r>
+              <w:t>2 wks (S2 W8)</w:t>
+            </w:r>
+          </w:p>
+        </w:tc>
+        <w:tc>
+          <w:tcPr>
+            <w:tcW w:w="1612" w:type="dxa"/>
+          </w:tcPr>
+          <w:p>
+            <w:r>
+              <w:t>A9, A10</w:t>
+            </w:r>
+          </w:p>
+        </w:tc>
+      </w:tr>
+      <w:tr>
+        <w:tc>
+          <w:tcPr>
+            <w:tcW w:w="1134" w:type="dxa"/>
+          </w:tcPr>
+          <w:p>
+            <w:r>
+              <w:t>A12</w:t>
+            </w:r>
+          </w:p>
+        </w:tc>
+        <w:tc>
+          <w:tcPr>
+            <w:tcW w:w="4314" w:type="dxa"/>
+          </w:tcPr>
+          <w:p>
+            <w:r>
+              <w:t>Poster submission; Final Presentation and Poster Presentation</w:t>
+            </w:r>
+          </w:p>
+        </w:tc>
+        <w:tc>
+          <w:tcPr>
+            <w:tcW w:w="1587" w:type="dxa"/>
+          </w:tcPr>
+          <w:p>
+            <w:r>
+              <w:t>2 wks (S2 W9-10)</w:t>
+            </w:r>
+          </w:p>
+        </w:tc>
+        <w:tc>
+          <w:tcPr>
+            <w:tcW w:w="1612" w:type="dxa"/>
+          </w:tcPr>
+          <w:p>
+            <w:r>
+              <w:t>A11</w:t>
+            </w:r>
+          </w:p>
+        </w:tc>
+      </w:tr>
+      <w:tr>
+        <w:tc>
+          <w:tcPr>
+            <w:tcW w:w="1134" w:type="dxa"/>
+          </w:tcPr>
+          <w:p>
+            <w:r>
+              <w:t>A13</w:t>
+            </w:r>
+          </w:p>
+        </w:tc>
+        <w:tc>
+          <w:tcPr>
+            <w:tcW w:w="4314" w:type="dxa"/>
+          </w:tcPr>
+          <w:p>
+            <w:r>
+              <w:t>Revise Final Report based on presentation feedback; prepare demo video</w:t>
+            </w:r>
+          </w:p>
+        </w:tc>
+        <w:tc>
+          <w:tcPr>
+            <w:tcW w:w="1587" w:type="dxa"/>
+          </w:tcPr>
+          <w:p>
+            <w:r>
+              <w:t>2 wks (S2 W11-12)</w:t>
+            </w:r>
+          </w:p>
+        </w:tc>
+        <w:tc>
+          <w:tcPr>
+            <w:tcW w:w="1612" w:type="dxa"/>
+          </w:tcPr>
+          <w:p>
+            <w:r>
+              <w:t>A12</w:t>
+            </w:r>
+          </w:p>
+        </w:tc>
+      </w:tr>
+      <w:tr>
+        <w:tc>
+          <w:tcPr>
+            <w:tcW w:w="1134" w:type="dxa"/>
+          </w:tcPr>
+          <w:p>
+            <w:r>
+              <w:t>A14</w:t>
+            </w:r>
+          </w:p>
+        </w:tc>
+        <w:tc>
+          <w:tcPr>
+            <w:tcW w:w="4314" w:type="dxa"/>
+          </w:tcPr>
+          <w:p>
+            <w:r>
+              <w:t>Final Report submission, demo video submission, and optional conference-ready manuscript</w:t>
+            </w:r>
+          </w:p>
+        </w:tc>
+        <w:tc>
+          <w:tcPr>
+            <w:tcW w:w="1587" w:type="dxa"/>
+          </w:tcPr>
+          <w:p>
+            <w:r>
+              <w:t>1 wk (S2 W13)</w:t>
+            </w:r>
+          </w:p>
+        </w:tc>
+        <w:tc>
+          <w:tcPr>
+            <w:tcW w:w="1612" w:type="dxa"/>
+          </w:tcPr>
+          <w:p>
+            <w:r>
+              <w:t>A13</w:t>
+            </w:r>
+          </w:p>
+        </w:tc>
+      </w:tr>
+    </w:tbl>
+    <w:p/>
+    <w:p>
+      <w:r>
+        <w:rPr>
+          <w:b/>
+        </w:rPr>
+        <w:t>Key deliverables:</w:t>
       </w:r>
     </w:p>
     <w:p>
       <w:r>
-        <w:t>Refer to the FYP calendar for the tentative deadline and dates for reports and presentations.</w:t>
+        <w:t>D1 - Project Proposal &amp; Ethics Checklist - 10 Sep 2026</w:t>
       </w:r>
     </w:p>
     <w:p>
+      <w:r>
+        <w:t>D2 - Progress Report &amp; Progress Presentation - 12 / 19 Nov 2026</w:t>
+      </w:r>
+    </w:p>
+    <w:p>
+      <w:r>
+        <w:t>D3 - Final Presentation &amp; Poster Presentation - Week 10 (Mar 2027)</w:t>
+      </w:r>
+    </w:p>
+    <w:p>
+      <w:r>
+        <w:t>D4 - Final Report, Demo Video &amp; (optional) Conference Manuscript - 15 Apr 2027</w:t>
+      </w:r>
+    </w:p>
+    <w:p>
       <w:pPr>
         <w:pStyle w:val="Heading1"/>
       </w:pPr>
       <w:bookmarkStart w:id="7" w:name="_Toc453937403"/>
       <w:r>
+        <w:lastRenderedPageBreak/>
         <w:t>Risk Assessment</w:t>
       </w:r>
       <w:bookmarkEnd w:id="7"/>
     </w:p>
     <w:p>
       <w:r>
-        <w:t xml:space="preserve">This section describes the key risks of your project.  You are to determine (either quantitatively or qualitatively) the risks related to a concrete situation and a recognized threat to your project.  Contingency plans should also be stated.  </w:t>
-      </w:r>
-      <w:r>
-        <w:t>Follow the content requirement of Chapter 5 of the Final Report.</w:t>
+        <w:rPr>
+          <w:b/>
+        </w:rPr>
+        <w:t>Risk 1: Invalid or inaccurate DHT22 readings</w:t>
       </w:r>
     </w:p>
     <w:p>
-      <w:r>
-        <w:t>For example, if you work on a web crawler project in a specific website, there are possibilities that the crawler is forbidden by the website when they discover your intention. If you work on a hardware-related project, there are possibilities that the hardware cannot be delivered on time. Such kind of threats that potentially delay or even fail your project should be pre-cautioned and stated here.</w:t>
+      <w:pPr>
+        <w:pStyle w:val="ListParagraph"/>
+        <w:numPr>
+          <w:ilvl w:val="0"/>
+          <w:numId w:val="29"/>
+        </w:numPr>
+      </w:pPr>
+      <w:r>
+        <w:rPr>
+          <w:b/>
+        </w:rPr>
+        <w:t xml:space="preserve">Description: </w:t>
+      </w:r>
+      <w:r>
+        <w:t>The DHT22 occasionally returns out-of-range or spurious values. Such readings would corrupt the dataset and could break the accuracy (±0.5 °C, ±2 % RH) and capture-rate (≥99 %) objectives.</w:t>
       </w:r>
     </w:p>
     <w:p>
       <w:pPr>
+        <w:pStyle w:val="ListParagraph"/>
+        <w:numPr>
+          <w:ilvl w:val="0"/>
+          <w:numId w:val="29"/>
+        </w:numPr>
+      </w:pPr>
+      <w:r>
+        <w:rPr>
+          <w:b/>
+        </w:rPr>
+        <w:t xml:space="preserve">Probability of occurrence: </w:t>
+      </w:r>
+      <w:r>
+        <w:t>medium</w:t>
+      </w:r>
+    </w:p>
+    <w:p>
+      <w:pPr>
+        <w:pStyle w:val="ListParagraph"/>
+        <w:numPr>
+          <w:ilvl w:val="0"/>
+          <w:numId w:val="29"/>
+        </w:numPr>
+      </w:pPr>
+      <w:r>
+        <w:rPr>
+          <w:b/>
+        </w:rPr>
+        <w:t xml:space="preserve">Impact: </w:t>
+      </w:r>
+      <w:r>
+        <w:t>Medium. It corrupts data quality and threatens the verification targets.</w:t>
+      </w:r>
+    </w:p>
+    <w:p>
+      <w:pPr>
+        <w:pStyle w:val="ListParagraph"/>
+        <w:numPr>
+          <w:ilvl w:val="0"/>
+          <w:numId w:val="29"/>
+        </w:numPr>
+      </w:pPr>
+      <w:r>
+        <w:rPr>
+          <w:b/>
+        </w:rPr>
+        <w:t xml:space="preserve">Response: </w:t>
+      </w:r>
+      <w:r>
+        <w:t>Validate and retry each read, reject out-of-range values in the collection script, cross-check readings across multiple sensors, and calibrate against a reference thermometer and hygrometer.</w:t>
+      </w:r>
+    </w:p>
+    <w:p/>
+    <w:p>
+      <w:r>
+        <w:rPr>
+          <w:b/>
+        </w:rPr>
+        <w:t>Risk 2: Unstable network link between the Raspberry Pi and the server</w:t>
+      </w:r>
+    </w:p>
+    <w:p>
+      <w:pPr>
+        <w:pStyle w:val="ListParagraph"/>
+        <w:numPr>
+          <w:ilvl w:val="0"/>
+          <w:numId w:val="30"/>
+        </w:numPr>
+      </w:pPr>
+      <w:r>
+        <w:rPr>
+          <w:b/>
+        </w:rPr>
+        <w:t xml:space="preserve">Description: </w:t>
+      </w:r>
+      <w:r>
+        <w:t>Readings are transmitted from the Raspberry Pi to the central server over the local network. Intermittent connectivity drops readings and directly threatens the ≥99 % capture-rate target.</w:t>
+      </w:r>
+    </w:p>
+    <w:p>
+      <w:pPr>
+        <w:pStyle w:val="ListParagraph"/>
+        <w:numPr>
+          <w:ilvl w:val="0"/>
+          <w:numId w:val="30"/>
+        </w:numPr>
+      </w:pPr>
+      <w:r>
+        <w:rPr>
+          <w:b/>
+        </w:rPr>
+        <w:t xml:space="preserve">Probability of occurrence: </w:t>
+      </w:r>
+      <w:r>
+        <w:t>medium</w:t>
+      </w:r>
+    </w:p>
+    <w:p>
+      <w:pPr>
+        <w:pStyle w:val="ListParagraph"/>
+        <w:numPr>
+          <w:ilvl w:val="0"/>
+          <w:numId w:val="30"/>
+        </w:numPr>
+      </w:pPr>
+      <w:r>
+        <w:rPr>
+          <w:b/>
+        </w:rPr>
+        <w:t xml:space="preserve">Impact: </w:t>
+      </w:r>
+      <w:r>
+        <w:t>High. A single network outage window directly violates the primary capture-rate objective.</w:t>
+      </w:r>
+    </w:p>
+    <w:p>
+      <w:pPr>
+        <w:pStyle w:val="ListParagraph"/>
+        <w:numPr>
+          <w:ilvl w:val="0"/>
+          <w:numId w:val="30"/>
+        </w:numPr>
+      </w:pPr>
+      <w:r>
+        <w:rPr>
+          <w:b/>
+        </w:rPr>
+        <w:t xml:space="preserve">Response: </w:t>
+      </w:r>
+      <w:r>
+        <w:t>Buffer readings locally on the Raspberry Pi and re-transmit them when connectivity recovers; keep a local CSV copy as a fallback.</w:t>
+      </w:r>
+    </w:p>
+    <w:p/>
+    <w:p>
+      <w:r>
+        <w:rPr>
+          <w:b/>
+        </w:rPr>
+        <w:t>Risk 3: Alert delivery delay or failure</w:t>
+      </w:r>
+    </w:p>
+    <w:p>
+      <w:pPr>
+        <w:pStyle w:val="ListParagraph"/>
+        <w:numPr>
+          <w:ilvl w:val="0"/>
+          <w:numId w:val="31"/>
+        </w:numPr>
+      </w:pPr>
+      <w:r>
+        <w:rPr>
+          <w:b/>
+        </w:rPr>
+        <w:t xml:space="preserve">Description: </w:t>
+      </w:r>
+      <w:r>
+        <w:t>Threshold alerts are delivered through the Telegram Bot API. API unavailability or network delays could prevent the 10-second alert target from being met.</w:t>
+      </w:r>
+    </w:p>
+    <w:p>
+      <w:pPr>
+        <w:pStyle w:val="ListParagraph"/>
+        <w:numPr>
+          <w:ilvl w:val="0"/>
+          <w:numId w:val="31"/>
+        </w:numPr>
+      </w:pPr>
+      <w:r>
+        <w:rPr>
+          <w:b/>
+        </w:rPr>
+        <w:t xml:space="preserve">Probability of occurrence: </w:t>
+      </w:r>
+      <w:r>
+        <w:t>low</w:t>
+      </w:r>
+    </w:p>
+    <w:p>
+      <w:pPr>
+        <w:pStyle w:val="ListParagraph"/>
+        <w:numPr>
+          <w:ilvl w:val="0"/>
+          <w:numId w:val="31"/>
+        </w:numPr>
+      </w:pPr>
+      <w:r>
+        <w:rPr>
+          <w:b/>
+        </w:rPr>
+        <w:t xml:space="preserve">Impact: </w:t>
+      </w:r>
+      <w:r>
+        <w:t>Medium. Delayed alerts reduce the usefulness of the monitoring system but do not affect data collection.</w:t>
+      </w:r>
+    </w:p>
+    <w:p>
+      <w:pPr>
+        <w:pStyle w:val="ListParagraph"/>
+        <w:numPr>
+          <w:ilvl w:val="0"/>
+          <w:numId w:val="31"/>
+        </w:numPr>
+      </w:pPr>
+      <w:r>
+        <w:rPr>
+          <w:b/>
+        </w:rPr>
+        <w:t xml:space="preserve">Response: </w:t>
+      </w:r>
+      <w:r>
+        <w:t>Evaluate thresholds at the point of ingestion, retry sending with backoff, and use SMTP email as a secondary notification channel.</w:t>
+      </w:r>
+    </w:p>
+    <w:p/>
+    <w:p>
+      <w:r>
+        <w:rPr>
+          <w:b/>
+        </w:rPr>
+        <w:t>Risk 4: Server downtime or SQLite data corruption</w:t>
+      </w:r>
+    </w:p>
+    <w:p>
+      <w:pPr>
+        <w:pStyle w:val="ListParagraph"/>
+        <w:numPr>
+          <w:ilvl w:val="0"/>
+          <w:numId w:val="32"/>
+        </w:numPr>
+      </w:pPr>
+      <w:r>
+        <w:rPr>
+          <w:b/>
+        </w:rPr>
+        <w:lastRenderedPageBreak/>
+        <w:t xml:space="preserve">Description: </w:t>
+      </w:r>
+      <w:r>
+        <w:t>The server runs on a single virtual machine. A crash or database corruption would lose the stored history and break the query and export functions.</w:t>
+      </w:r>
+    </w:p>
+    <w:p>
+      <w:pPr>
+        <w:pStyle w:val="ListParagraph"/>
+        <w:numPr>
+          <w:ilvl w:val="0"/>
+          <w:numId w:val="32"/>
+        </w:numPr>
+      </w:pPr>
+      <w:r>
+        <w:rPr>
+          <w:b/>
+        </w:rPr>
+        <w:t xml:space="preserve">Probability of occurrence: </w:t>
+      </w:r>
+      <w:r>
+        <w:t>low</w:t>
+      </w:r>
+    </w:p>
+    <w:p>
+      <w:pPr>
+        <w:pStyle w:val="ListParagraph"/>
+        <w:numPr>
+          <w:ilvl w:val="0"/>
+          <w:numId w:val="32"/>
+        </w:numPr>
+      </w:pPr>
+      <w:r>
+        <w:rPr>
+          <w:b/>
+        </w:rPr>
+        <w:t xml:space="preserve">Impact: </w:t>
+      </w:r>
+      <w:r>
+        <w:t>High. Losing all stored readings undermines the data-persistence and reporting objectives.</w:t>
+      </w:r>
+    </w:p>
+    <w:p>
+      <w:pPr>
+        <w:pStyle w:val="ListParagraph"/>
+        <w:numPr>
+          <w:ilvl w:val="0"/>
+          <w:numId w:val="32"/>
+        </w:numPr>
+      </w:pPr>
+      <w:r>
+        <w:rPr>
+          <w:b/>
+        </w:rPr>
+        <w:t xml:space="preserve">Response: </w:t>
+      </w:r>
+      <w:r>
+        <w:t>Enable SQLite WAL mode, schedule regular database backups, and retain the appended CSV as a secondary record.</w:t>
+      </w:r>
+    </w:p>
+    <w:p/>
+    <w:p>
+      <w:r>
+        <w:rPr>
+          <w:b/>
+        </w:rPr>
+        <w:t>Risk 5: Query or export performance targets missed</w:t>
+      </w:r>
+    </w:p>
+    <w:p>
+      <w:pPr>
+        <w:pStyle w:val="ListParagraph"/>
+        <w:numPr>
+          <w:ilvl w:val="0"/>
+          <w:numId w:val="33"/>
+        </w:numPr>
+      </w:pPr>
+      <w:r>
+        <w:rPr>
+          <w:b/>
+        </w:rPr>
+        <w:t xml:space="preserve">Description: </w:t>
+      </w:r>
+      <w:r>
+        <w:t>Large date-range queries on the readings table could exceed the 1-second query and 5-second export limits.</w:t>
+      </w:r>
+    </w:p>
+    <w:p>
+      <w:pPr>
+        <w:pStyle w:val="ListParagraph"/>
+        <w:numPr>
+          <w:ilvl w:val="0"/>
+          <w:numId w:val="33"/>
+        </w:numPr>
+      </w:pPr>
+      <w:r>
+        <w:rPr>
+          <w:b/>
+        </w:rPr>
+        <w:t xml:space="preserve">Probability of occurrence: </w:t>
+      </w:r>
+      <w:r>
+        <w:t>low</w:t>
+      </w:r>
+    </w:p>
+    <w:p>
+      <w:pPr>
+        <w:pStyle w:val="ListParagraph"/>
+        <w:numPr>
+          <w:ilvl w:val="0"/>
+          <w:numId w:val="33"/>
+        </w:numPr>
+      </w:pPr>
+      <w:r>
+        <w:rPr>
+          <w:b/>
+        </w:rPr>
+        <w:t xml:space="preserve">Impact: </w:t>
+      </w:r>
+      <w:r>
+        <w:t>Medium. It fails the performance objectives but does not stop the system from functioning.</w:t>
+      </w:r>
+    </w:p>
+    <w:p>
+      <w:pPr>
+        <w:pStyle w:val="ListParagraph"/>
+        <w:numPr>
+          <w:ilvl w:val="0"/>
+          <w:numId w:val="33"/>
+        </w:numPr>
+      </w:pPr>
+      <w:r>
+        <w:rPr>
+          <w:b/>
+        </w:rPr>
+        <w:t xml:space="preserve">Response: </w:t>
+      </w:r>
+      <w:r>
+        <w:t>Index the timestamp column, pre-aggregate data, and paginate large exports.</w:t>
+      </w:r>
+    </w:p>
+    <w:p>
+      <w:pPr>
+        <w:rPr>
+          <w:rFonts w:eastAsiaTheme="minorEastAsia" w:hint="eastAsia"/>
+          <w:lang w:eastAsia="zh-CN"/>
+        </w:rPr>
+      </w:pPr>
+    </w:p>
+    <w:tbl>
+      <w:tblPr>
+        <w:tblStyle w:val="TableGrid"/>
+        <w:tblW w:w="0" w:type="auto"/>
+        <w:tblLayout w:type="fixed"/>
+        <w:tblLook w:val="04A0" w:firstRow="1" w:lastRow="0" w:firstColumn="1" w:lastColumn="0" w:noHBand="0" w:noVBand="1"/>
+      </w:tblPr>
+      <w:tblGrid>
+        <w:gridCol w:w="1247"/>
+        <w:gridCol w:w="7257"/>
+      </w:tblGrid>
+      <w:tr>
+        <w:tc>
+          <w:tcPr>
+            <w:tcW w:w="1247" w:type="dxa"/>
+            <w:shd w:val="clear" w:color="auto" w:fill="D9D9D9"/>
+          </w:tcPr>
+          <w:p>
+            <w:r>
+              <w:rPr>
+                <w:b/>
+              </w:rPr>
+              <w:t>Priority</w:t>
+            </w:r>
+          </w:p>
+        </w:tc>
+        <w:tc>
+          <w:tcPr>
+            <w:tcW w:w="7257" w:type="dxa"/>
+            <w:shd w:val="clear" w:color="auto" w:fill="D9D9D9"/>
+          </w:tcPr>
+          <w:p>
+            <w:pPr>
+              <w:ind w:firstLineChars="700" w:firstLine="1542"/>
+            </w:pPr>
+            <w:r>
+              <w:rPr>
+                <w:b/>
+              </w:rPr>
+              <w:t>Risk Identifier and Description</w:t>
+            </w:r>
+          </w:p>
+        </w:tc>
+      </w:tr>
+      <w:tr>
+        <w:tc>
+          <w:tcPr>
+            <w:tcW w:w="1247" w:type="dxa"/>
+          </w:tcPr>
+          <w:p>
+            <w:r>
+              <w:t>1</w:t>
+            </w:r>
+          </w:p>
+        </w:tc>
+        <w:tc>
+          <w:tcPr>
+            <w:tcW w:w="7257" w:type="dxa"/>
+          </w:tcPr>
+          <w:p>
+            <w:r>
+              <w:t>Risk 2: Unstable network link between the Raspberry Pi and the server</w:t>
+            </w:r>
+          </w:p>
+        </w:tc>
+      </w:tr>
+      <w:tr>
+        <w:tc>
+          <w:tcPr>
+            <w:tcW w:w="1247" w:type="dxa"/>
+          </w:tcPr>
+          <w:p>
+            <w:r>
+              <w:t>2</w:t>
+            </w:r>
+          </w:p>
+        </w:tc>
+        <w:tc>
+          <w:tcPr>
+            <w:tcW w:w="7257" w:type="dxa"/>
+          </w:tcPr>
+          <w:p>
+            <w:r>
+              <w:t>Risk 4: Server downtime or SQLite data corruption</w:t>
+            </w:r>
+          </w:p>
+        </w:tc>
+      </w:tr>
+      <w:tr>
+        <w:tc>
+          <w:tcPr>
+            <w:tcW w:w="1247" w:type="dxa"/>
+          </w:tcPr>
+          <w:p>
+            <w:r>
+              <w:t>3</w:t>
+            </w:r>
+          </w:p>
+        </w:tc>
+        <w:tc>
+          <w:tcPr>
+            <w:tcW w:w="7257" w:type="dxa"/>
+          </w:tcPr>
+          <w:p>
+            <w:r>
+              <w:t>Risk 1: Invalid or inaccurate DHT22 readings</w:t>
+            </w:r>
+          </w:p>
+        </w:tc>
+      </w:tr>
+      <w:tr>
+        <w:tc>
+          <w:tcPr>
+            <w:tcW w:w="1247" w:type="dxa"/>
+          </w:tcPr>
+          <w:p>
+            <w:r>
+              <w:t>4</w:t>
+            </w:r>
+          </w:p>
+        </w:tc>
+        <w:tc>
+          <w:tcPr>
+            <w:tcW w:w="7257" w:type="dxa"/>
+          </w:tcPr>
+          <w:p>
+            <w:r>
+              <w:t>Risk 3: Alert delivery delay or failure</w:t>
+            </w:r>
+          </w:p>
+        </w:tc>
+      </w:tr>
+      <w:tr>
+        <w:tc>
+          <w:tcPr>
+            <w:tcW w:w="1247" w:type="dxa"/>
+          </w:tcPr>
+          <w:p>
+            <w:r>
+              <w:t>5</w:t>
+            </w:r>
+          </w:p>
+        </w:tc>
+        <w:tc>
+          <w:tcPr>
+            <w:tcW w:w="7257" w:type="dxa"/>
+          </w:tcPr>
+          <w:p>
+            <w:r>
+              <w:t>Risk 5: Query or export performance targets missed</w:t>
+            </w:r>
+          </w:p>
+        </w:tc>
+      </w:tr>
+    </w:tbl>
+    <w:p>
+      <w:pPr>
         <w:pStyle w:val="Heading1withoutnumbering"/>
+        <w:rPr>
+          <w:lang w:eastAsia="zh-CN"/>
+        </w:rPr>
       </w:pPr>
       <w:bookmarkStart w:id="8" w:name="_Toc167888729"/>
-      <w:r>
-        <w:lastRenderedPageBreak/>
+    </w:p>
+    <w:p>
+      <w:pPr>
+        <w:rPr>
+          <w:rFonts w:eastAsiaTheme="minorEastAsia"/>
+          <w:lang w:eastAsia="zh-CN"/>
+        </w:rPr>
+      </w:pPr>
+    </w:p>
+    <w:p>
+      <w:pPr>
+        <w:rPr>
+          <w:rFonts w:eastAsiaTheme="minorEastAsia"/>
+          <w:lang w:eastAsia="zh-CN"/>
+        </w:rPr>
+      </w:pPr>
+    </w:p>
+    <w:p>
+      <w:pPr>
+        <w:rPr>
+          <w:rFonts w:eastAsiaTheme="minorEastAsia"/>
+          <w:lang w:eastAsia="zh-CN"/>
+        </w:rPr>
+      </w:pPr>
+    </w:p>
+    <w:tbl>
+      <w:tblPr>
+        <w:tblStyle w:val="TableGrid"/>
+        <w:tblW w:w="5731" w:type="dxa"/>
+        <w:tblInd w:w="1384" w:type="dxa"/>
+        <w:tblLayout w:type="fixed"/>
+        <w:tblLook w:val="04A0" w:firstRow="1" w:lastRow="0" w:firstColumn="1" w:lastColumn="0" w:noHBand="0" w:noVBand="1"/>
+      </w:tblPr>
+      <w:tblGrid>
+        <w:gridCol w:w="567"/>
+        <w:gridCol w:w="1843"/>
+        <w:gridCol w:w="1053"/>
+        <w:gridCol w:w="1134"/>
+        <w:gridCol w:w="1134"/>
+      </w:tblGrid>
+      <w:tr>
+        <w:trPr>
+          <w:trHeight w:val="914"/>
+        </w:trPr>
+        <w:tc>
+          <w:tcPr>
+            <w:tcW w:w="567" w:type="dxa"/>
+            <w:vMerge w:val="restart"/>
+            <w:tcBorders>
+              <w:top w:val="nil"/>
+              <w:left w:val="nil"/>
+              <w:bottom w:val="nil"/>
+              <w:right w:val="nil"/>
+            </w:tcBorders>
+            <w:textDirection w:val="btLr"/>
+          </w:tcPr>
+          <w:p>
+            <w:pPr>
+              <w:ind w:left="-247" w:right="113"/>
+              <w:jc w:val="center"/>
+              <w:rPr>
+                <w:rFonts w:eastAsiaTheme="minorEastAsia"/>
+                <w:b/>
+                <w:lang w:eastAsia="zh-CN"/>
+              </w:rPr>
+            </w:pPr>
+            <w:r>
+              <w:rPr>
+                <w:rFonts w:eastAsiaTheme="minorEastAsia"/>
+                <w:b/>
+                <w:lang w:eastAsia="zh-CN"/>
+              </w:rPr>
+              <w:lastRenderedPageBreak/>
+              <w:t>Probability</w:t>
+            </w:r>
+          </w:p>
+        </w:tc>
+        <w:tc>
+          <w:tcPr>
+            <w:tcW w:w="1843" w:type="dxa"/>
+            <w:tcBorders>
+              <w:top w:val="nil"/>
+              <w:left w:val="nil"/>
+              <w:bottom w:val="nil"/>
+              <w:right w:val="single" w:sz="4" w:space="0" w:color="auto"/>
+            </w:tcBorders>
+            <w:vAlign w:val="center"/>
+          </w:tcPr>
+          <w:p>
+            <w:pPr>
+              <w:ind w:left="-360"/>
+              <w:jc w:val="right"/>
+              <w:rPr>
+                <w:rFonts w:eastAsiaTheme="minorEastAsia"/>
+                <w:lang w:eastAsia="zh-CN"/>
+              </w:rPr>
+            </w:pPr>
+            <w:r>
+              <w:rPr>
+                <w:rFonts w:eastAsiaTheme="minorEastAsia"/>
+                <w:lang w:eastAsia="zh-CN"/>
+              </w:rPr>
+              <w:t>High</w:t>
+            </w:r>
+          </w:p>
+        </w:tc>
+        <w:tc>
+          <w:tcPr>
+            <w:tcW w:w="1053" w:type="dxa"/>
+            <w:tcBorders>
+              <w:left w:val="single" w:sz="4" w:space="0" w:color="auto"/>
+            </w:tcBorders>
+          </w:tcPr>
+          <w:p>
+            <w:pPr>
+              <w:ind w:left="-360"/>
+              <w:rPr>
+                <w:rFonts w:eastAsiaTheme="minorEastAsia"/>
+                <w:lang w:eastAsia="zh-CN"/>
+              </w:rPr>
+            </w:pPr>
+          </w:p>
+        </w:tc>
+        <w:tc>
+          <w:tcPr>
+            <w:tcW w:w="1134" w:type="dxa"/>
+            <w:vAlign w:val="center"/>
+          </w:tcPr>
+          <w:p>
+            <w:pPr>
+              <w:ind w:left="-360"/>
+              <w:jc w:val="center"/>
+              <w:rPr>
+                <w:rFonts w:eastAsiaTheme="minorEastAsia"/>
+                <w:lang w:eastAsia="zh-CN"/>
+              </w:rPr>
+            </w:pPr>
+          </w:p>
+        </w:tc>
+        <w:tc>
+          <w:tcPr>
+            <w:tcW w:w="1134" w:type="dxa"/>
+            <w:vAlign w:val="center"/>
+          </w:tcPr>
+          <w:p>
+            <w:pPr>
+              <w:ind w:left="-360"/>
+              <w:jc w:val="center"/>
+              <w:rPr>
+                <w:rFonts w:eastAsiaTheme="minorEastAsia"/>
+                <w:lang w:eastAsia="zh-CN"/>
+              </w:rPr>
+            </w:pPr>
+          </w:p>
+        </w:tc>
+      </w:tr>
+      <w:tr>
+        <w:trPr>
+          <w:trHeight w:val="920"/>
+        </w:trPr>
+        <w:tc>
+          <w:tcPr>
+            <w:tcW w:w="567" w:type="dxa"/>
+            <w:vMerge/>
+            <w:tcBorders>
+              <w:top w:val="nil"/>
+              <w:left w:val="nil"/>
+              <w:bottom w:val="nil"/>
+              <w:right w:val="nil"/>
+            </w:tcBorders>
+          </w:tcPr>
+          <w:p>
+            <w:pPr>
+              <w:pStyle w:val="ListParagraph"/>
+              <w:numPr>
+                <w:ilvl w:val="0"/>
+                <w:numId w:val="25"/>
+              </w:numPr>
+              <w:ind w:left="0"/>
+              <w:rPr>
+                <w:rFonts w:eastAsiaTheme="minorEastAsia"/>
+                <w:lang w:eastAsia="zh-CN"/>
+              </w:rPr>
+            </w:pPr>
+          </w:p>
+        </w:tc>
+        <w:tc>
+          <w:tcPr>
+            <w:tcW w:w="1843" w:type="dxa"/>
+            <w:tcBorders>
+              <w:top w:val="nil"/>
+              <w:left w:val="nil"/>
+              <w:bottom w:val="nil"/>
+              <w:right w:val="single" w:sz="4" w:space="0" w:color="auto"/>
+            </w:tcBorders>
+            <w:vAlign w:val="center"/>
+          </w:tcPr>
+          <w:p>
+            <w:pPr>
+              <w:pStyle w:val="ListParagraph"/>
+              <w:numPr>
+                <w:ilvl w:val="0"/>
+                <w:numId w:val="25"/>
+              </w:numPr>
+              <w:tabs>
+                <w:tab w:val="right" w:pos="1581"/>
+              </w:tabs>
+              <w:ind w:left="0"/>
+              <w:jc w:val="right"/>
+              <w:rPr>
+                <w:rFonts w:eastAsiaTheme="minorEastAsia"/>
+                <w:lang w:eastAsia="zh-CN"/>
+              </w:rPr>
+            </w:pPr>
+            <w:r>
+              <w:rPr>
+                <w:rFonts w:eastAsiaTheme="minorEastAsia"/>
+                <w:lang w:eastAsia="zh-CN"/>
+              </w:rPr>
+              <w:tab/>
+              <w:t>Medium</w:t>
+            </w:r>
+          </w:p>
+        </w:tc>
+        <w:tc>
+          <w:tcPr>
+            <w:tcW w:w="1053" w:type="dxa"/>
+            <w:tcBorders>
+              <w:left w:val="single" w:sz="4" w:space="0" w:color="auto"/>
+            </w:tcBorders>
+          </w:tcPr>
+          <w:p>
+            <w:pPr>
+              <w:ind w:left="-1699"/>
+              <w:rPr>
+                <w:rFonts w:eastAsiaTheme="minorEastAsia"/>
+                <w:lang w:eastAsia="zh-CN"/>
+              </w:rPr>
+            </w:pPr>
+          </w:p>
+        </w:tc>
+        <w:tc>
+          <w:tcPr>
+            <w:tcW w:w="1134" w:type="dxa"/>
+            <w:vAlign w:val="center"/>
+          </w:tcPr>
+          <w:p>
+            <w:pPr>
+              <w:rPr>
+                <w:rFonts w:eastAsiaTheme="minorEastAsia" w:hint="eastAsia"/>
+                <w:lang w:eastAsia="zh-CN"/>
+              </w:rPr>
+            </w:pPr>
+          </w:p>
+        </w:tc>
+        <w:tc>
+          <w:tcPr>
+            <w:tcW w:w="1134" w:type="dxa"/>
+            <w:vAlign w:val="center"/>
+          </w:tcPr>
+          <w:p>
+            <w:pPr>
+              <w:ind w:left="-360"/>
+              <w:jc w:val="center"/>
+              <w:rPr>
+                <w:rFonts w:eastAsiaTheme="minorEastAsia"/>
+                <w:lang w:eastAsia="zh-CN"/>
+              </w:rPr>
+            </w:pPr>
+          </w:p>
+        </w:tc>
+      </w:tr>
+      <w:tr>
+        <w:trPr>
+          <w:trHeight w:val="848"/>
+        </w:trPr>
+        <w:tc>
+          <w:tcPr>
+            <w:tcW w:w="567" w:type="dxa"/>
+            <w:vMerge/>
+            <w:tcBorders>
+              <w:top w:val="nil"/>
+              <w:left w:val="nil"/>
+              <w:bottom w:val="nil"/>
+              <w:right w:val="nil"/>
+            </w:tcBorders>
+          </w:tcPr>
+          <w:p>
+            <w:pPr>
+              <w:pStyle w:val="ListParagraph"/>
+              <w:numPr>
+                <w:ilvl w:val="0"/>
+                <w:numId w:val="25"/>
+              </w:numPr>
+              <w:ind w:left="0"/>
+              <w:rPr>
+                <w:rFonts w:eastAsiaTheme="minorEastAsia"/>
+                <w:lang w:eastAsia="zh-CN"/>
+              </w:rPr>
+            </w:pPr>
+          </w:p>
+        </w:tc>
+        <w:tc>
+          <w:tcPr>
+            <w:tcW w:w="1843" w:type="dxa"/>
+            <w:tcBorders>
+              <w:top w:val="nil"/>
+              <w:left w:val="nil"/>
+              <w:bottom w:val="nil"/>
+              <w:right w:val="single" w:sz="4" w:space="0" w:color="auto"/>
+            </w:tcBorders>
+            <w:vAlign w:val="center"/>
+          </w:tcPr>
+          <w:p>
+            <w:pPr>
+              <w:ind w:left="-360"/>
+              <w:jc w:val="right"/>
+              <w:rPr>
+                <w:rFonts w:eastAsiaTheme="minorEastAsia" w:hint="eastAsia"/>
+                <w:lang w:eastAsia="zh-CN"/>
+              </w:rPr>
+            </w:pPr>
+            <w:r>
+              <w:rPr>
+                <w:rFonts w:eastAsiaTheme="minorEastAsia"/>
+                <w:lang w:eastAsia="zh-CN"/>
+              </w:rPr>
+              <w:t>Low</w:t>
+            </w:r>
+          </w:p>
+        </w:tc>
+        <w:tc>
+          <w:tcPr>
+            <w:tcW w:w="1053" w:type="dxa"/>
+            <w:tcBorders>
+              <w:left w:val="single" w:sz="4" w:space="0" w:color="auto"/>
+              <w:bottom w:val="single" w:sz="4" w:space="0" w:color="auto"/>
+            </w:tcBorders>
+          </w:tcPr>
+          <w:p>
+            <w:pPr>
+              <w:tabs>
+                <w:tab w:val="left" w:pos="250"/>
+              </w:tabs>
+              <w:ind w:left="-360"/>
+              <w:rPr>
+                <w:rFonts w:eastAsiaTheme="minorEastAsia"/>
+                <w:sz w:val="15"/>
+                <w:szCs w:val="15"/>
+                <w:lang w:eastAsia="zh-CN"/>
+              </w:rPr>
+            </w:pPr>
+            <w:r>
+              <w:rPr>
+                <w:rFonts w:eastAsiaTheme="minorEastAsia"/>
+                <w:lang w:eastAsia="zh-CN"/>
+              </w:rPr>
+              <w:tab/>
+            </w:r>
+            <w:r>
+              <w:rPr>
+                <w:rFonts w:eastAsiaTheme="minorEastAsia" w:hint="eastAsia"/>
+                <w:sz w:val="15"/>
+                <w:szCs w:val="15"/>
+                <w:lang w:eastAsia="zh-CN"/>
+              </w:rPr>
+              <w:t>Risk3</w:t>
+            </w:r>
+          </w:p>
+          <w:p>
+            <w:pPr>
+              <w:tabs>
+                <w:tab w:val="left" w:pos="250"/>
+              </w:tabs>
+              <w:ind w:left="-360"/>
+              <w:jc w:val="center"/>
+              <w:rPr>
+                <w:rFonts w:eastAsiaTheme="minorEastAsia"/>
+                <w:sz w:val="15"/>
+                <w:szCs w:val="15"/>
+                <w:lang w:eastAsia="zh-CN"/>
+              </w:rPr>
+            </w:pPr>
+            <w:r>
+              <w:rPr>
+                <w:rFonts w:eastAsiaTheme="minorEastAsia" w:hint="eastAsia"/>
+                <w:sz w:val="15"/>
+                <w:szCs w:val="15"/>
+                <w:lang w:eastAsia="zh-CN"/>
+              </w:rPr>
+              <w:t xml:space="preserve">            Risk4</w:t>
+            </w:r>
+          </w:p>
+          <w:p>
+            <w:pPr>
+              <w:tabs>
+                <w:tab w:val="left" w:pos="250"/>
+              </w:tabs>
+              <w:ind w:left="-360"/>
+              <w:jc w:val="center"/>
+              <w:rPr>
+                <w:rFonts w:eastAsiaTheme="minorEastAsia" w:hint="eastAsia"/>
+                <w:sz w:val="15"/>
+                <w:szCs w:val="15"/>
+                <w:lang w:eastAsia="zh-CN"/>
+              </w:rPr>
+            </w:pPr>
+            <w:r>
+              <w:rPr>
+                <w:rFonts w:eastAsiaTheme="minorEastAsia" w:hint="eastAsia"/>
+                <w:sz w:val="15"/>
+                <w:szCs w:val="15"/>
+                <w:lang w:eastAsia="zh-CN"/>
+              </w:rPr>
+              <w:t xml:space="preserve">           Risk5</w:t>
+            </w:r>
+          </w:p>
+        </w:tc>
+        <w:tc>
+          <w:tcPr>
+            <w:tcW w:w="1134" w:type="dxa"/>
+            <w:tcBorders>
+              <w:bottom w:val="single" w:sz="4" w:space="0" w:color="auto"/>
+            </w:tcBorders>
+          </w:tcPr>
+          <w:p>
+            <w:pPr>
+              <w:ind w:left="-360"/>
+              <w:jc w:val="center"/>
+              <w:rPr>
+                <w:rFonts w:eastAsiaTheme="minorEastAsia"/>
+                <w:sz w:val="15"/>
+                <w:szCs w:val="15"/>
+                <w:lang w:eastAsia="zh-CN"/>
+              </w:rPr>
+            </w:pPr>
+            <w:r>
+              <w:rPr>
+                <w:rFonts w:eastAsiaTheme="minorEastAsia" w:hint="eastAsia"/>
+                <w:sz w:val="15"/>
+                <w:szCs w:val="15"/>
+                <w:lang w:eastAsia="zh-CN"/>
+              </w:rPr>
+              <w:t xml:space="preserve">        </w:t>
+            </w:r>
+            <w:r>
+              <w:rPr>
+                <w:rFonts w:eastAsiaTheme="minorEastAsia" w:hint="eastAsia"/>
+                <w:sz w:val="15"/>
+                <w:szCs w:val="15"/>
+                <w:lang w:eastAsia="zh-CN"/>
+              </w:rPr>
+              <w:t>Risk1</w:t>
+            </w:r>
+          </w:p>
+          <w:p>
+            <w:pPr>
+              <w:ind w:left="-360"/>
+              <w:jc w:val="center"/>
+              <w:rPr>
+                <w:rFonts w:eastAsiaTheme="minorEastAsia"/>
+                <w:sz w:val="15"/>
+                <w:szCs w:val="15"/>
+                <w:lang w:eastAsia="zh-CN"/>
+              </w:rPr>
+            </w:pPr>
+          </w:p>
+          <w:p>
+            <w:pPr>
+              <w:ind w:left="-360"/>
+              <w:jc w:val="center"/>
+              <w:rPr>
+                <w:rFonts w:eastAsiaTheme="minorEastAsia" w:hint="eastAsia"/>
+                <w:sz w:val="15"/>
+                <w:szCs w:val="15"/>
+                <w:lang w:eastAsia="zh-CN"/>
+              </w:rPr>
+            </w:pPr>
+            <w:r>
+              <w:rPr>
+                <w:rFonts w:eastAsiaTheme="minorEastAsia" w:hint="eastAsia"/>
+                <w:sz w:val="15"/>
+                <w:szCs w:val="15"/>
+                <w:lang w:eastAsia="zh-CN"/>
+              </w:rPr>
+              <w:t xml:space="preserve">        Risk2</w:t>
+            </w:r>
+          </w:p>
+        </w:tc>
+        <w:tc>
+          <w:tcPr>
+            <w:tcW w:w="1134" w:type="dxa"/>
+            <w:tcBorders>
+              <w:bottom w:val="single" w:sz="4" w:space="0" w:color="auto"/>
+            </w:tcBorders>
+          </w:tcPr>
+          <w:p>
+            <w:pPr>
+              <w:ind w:left="-360"/>
+              <w:rPr>
+                <w:rFonts w:eastAsiaTheme="minorEastAsia"/>
+                <w:lang w:eastAsia="zh-CN"/>
+              </w:rPr>
+            </w:pPr>
+          </w:p>
+        </w:tc>
+      </w:tr>
+      <w:tr>
+        <w:tc>
+          <w:tcPr>
+            <w:tcW w:w="567" w:type="dxa"/>
+            <w:tcBorders>
+              <w:top w:val="nil"/>
+              <w:left w:val="nil"/>
+              <w:bottom w:val="nil"/>
+              <w:right w:val="nil"/>
+            </w:tcBorders>
+          </w:tcPr>
+          <w:p>
+            <w:pPr>
+              <w:pStyle w:val="ListParagraph"/>
+              <w:numPr>
+                <w:ilvl w:val="0"/>
+                <w:numId w:val="25"/>
+              </w:numPr>
+              <w:ind w:left="0"/>
+              <w:rPr>
+                <w:rFonts w:eastAsiaTheme="minorEastAsia"/>
+                <w:lang w:eastAsia="zh-CN"/>
+              </w:rPr>
+            </w:pPr>
+          </w:p>
+        </w:tc>
+        <w:tc>
+          <w:tcPr>
+            <w:tcW w:w="1843" w:type="dxa"/>
+            <w:tcBorders>
+              <w:top w:val="nil"/>
+              <w:left w:val="nil"/>
+              <w:bottom w:val="nil"/>
+              <w:right w:val="nil"/>
+            </w:tcBorders>
+          </w:tcPr>
+          <w:p>
+            <w:pPr>
+              <w:pStyle w:val="ListParagraph"/>
+              <w:numPr>
+                <w:ilvl w:val="0"/>
+                <w:numId w:val="25"/>
+              </w:numPr>
+              <w:ind w:left="0"/>
+              <w:rPr>
+                <w:rFonts w:eastAsiaTheme="minorEastAsia"/>
+                <w:lang w:eastAsia="zh-CN"/>
+              </w:rPr>
+            </w:pPr>
+          </w:p>
+        </w:tc>
+        <w:tc>
+          <w:tcPr>
+            <w:tcW w:w="1053" w:type="dxa"/>
+            <w:tcBorders>
+              <w:top w:val="single" w:sz="4" w:space="0" w:color="auto"/>
+              <w:left w:val="nil"/>
+              <w:bottom w:val="nil"/>
+              <w:right w:val="nil"/>
+            </w:tcBorders>
+          </w:tcPr>
+          <w:p>
+            <w:pPr>
+              <w:tabs>
+                <w:tab w:val="center" w:pos="726"/>
+                <w:tab w:val="right" w:pos="1452"/>
+              </w:tabs>
+              <w:ind w:left="-360"/>
+              <w:jc w:val="center"/>
+              <w:rPr>
+                <w:rFonts w:eastAsiaTheme="minorEastAsia"/>
+                <w:lang w:eastAsia="zh-CN"/>
+              </w:rPr>
+            </w:pPr>
+            <w:r>
+              <w:rPr>
+                <w:rFonts w:eastAsiaTheme="minorEastAsia"/>
+                <w:lang w:eastAsia="zh-CN"/>
+              </w:rPr>
+              <w:t>Low</w:t>
+            </w:r>
+          </w:p>
+        </w:tc>
+        <w:tc>
+          <w:tcPr>
+            <w:tcW w:w="1134" w:type="dxa"/>
+            <w:tcBorders>
+              <w:top w:val="single" w:sz="4" w:space="0" w:color="auto"/>
+              <w:left w:val="nil"/>
+              <w:bottom w:val="nil"/>
+              <w:right w:val="nil"/>
+            </w:tcBorders>
+          </w:tcPr>
+          <w:p>
+            <w:pPr>
+              <w:ind w:left="-360"/>
+              <w:jc w:val="center"/>
+              <w:rPr>
+                <w:rFonts w:eastAsiaTheme="minorEastAsia"/>
+                <w:lang w:eastAsia="zh-CN"/>
+              </w:rPr>
+            </w:pPr>
+            <w:r>
+              <w:rPr>
+                <w:rFonts w:eastAsiaTheme="minorEastAsia"/>
+                <w:lang w:eastAsia="zh-CN"/>
+              </w:rPr>
+              <w:t>Medium</w:t>
+            </w:r>
+          </w:p>
+        </w:tc>
+        <w:tc>
+          <w:tcPr>
+            <w:tcW w:w="1134" w:type="dxa"/>
+            <w:tcBorders>
+              <w:top w:val="single" w:sz="4" w:space="0" w:color="auto"/>
+              <w:left w:val="nil"/>
+              <w:bottom w:val="nil"/>
+              <w:right w:val="nil"/>
+            </w:tcBorders>
+          </w:tcPr>
+          <w:p>
+            <w:pPr>
+              <w:ind w:left="-360"/>
+              <w:jc w:val="center"/>
+              <w:rPr>
+                <w:rFonts w:eastAsiaTheme="minorEastAsia"/>
+                <w:lang w:eastAsia="zh-CN"/>
+              </w:rPr>
+            </w:pPr>
+            <w:r>
+              <w:rPr>
+                <w:rFonts w:eastAsiaTheme="minorEastAsia"/>
+                <w:lang w:eastAsia="zh-CN"/>
+              </w:rPr>
+              <w:t>High</w:t>
+            </w:r>
+          </w:p>
+        </w:tc>
+      </w:tr>
+      <w:tr>
+        <w:tc>
+          <w:tcPr>
+            <w:tcW w:w="567" w:type="dxa"/>
+            <w:tcBorders>
+              <w:top w:val="nil"/>
+              <w:left w:val="nil"/>
+              <w:bottom w:val="nil"/>
+              <w:right w:val="nil"/>
+            </w:tcBorders>
+          </w:tcPr>
+          <w:p>
+            <w:pPr>
+              <w:pStyle w:val="ListParagraph"/>
+              <w:numPr>
+                <w:ilvl w:val="0"/>
+                <w:numId w:val="25"/>
+              </w:numPr>
+              <w:ind w:left="0"/>
+              <w:rPr>
+                <w:rFonts w:eastAsiaTheme="minorEastAsia"/>
+                <w:lang w:eastAsia="zh-CN"/>
+              </w:rPr>
+            </w:pPr>
+          </w:p>
+        </w:tc>
+        <w:tc>
+          <w:tcPr>
+            <w:tcW w:w="1843" w:type="dxa"/>
+            <w:tcBorders>
+              <w:top w:val="nil"/>
+              <w:left w:val="nil"/>
+              <w:bottom w:val="nil"/>
+              <w:right w:val="nil"/>
+            </w:tcBorders>
+          </w:tcPr>
+          <w:p>
+            <w:pPr>
+              <w:pStyle w:val="ListParagraph"/>
+              <w:numPr>
+                <w:ilvl w:val="0"/>
+                <w:numId w:val="25"/>
+              </w:numPr>
+              <w:ind w:left="0"/>
+              <w:rPr>
+                <w:rFonts w:eastAsiaTheme="minorEastAsia"/>
+                <w:lang w:eastAsia="zh-CN"/>
+              </w:rPr>
+            </w:pPr>
+          </w:p>
+        </w:tc>
+        <w:tc>
+          <w:tcPr>
+            <w:tcW w:w="3321" w:type="dxa"/>
+            <w:gridSpan w:val="3"/>
+            <w:tcBorders>
+              <w:top w:val="nil"/>
+              <w:left w:val="nil"/>
+              <w:bottom w:val="nil"/>
+              <w:right w:val="nil"/>
+            </w:tcBorders>
+          </w:tcPr>
+          <w:p>
+            <w:pPr>
+              <w:ind w:left="993"/>
+              <w:rPr>
+                <w:b/>
+                <w:bCs/>
+                <w:lang w:eastAsia="zh-CN"/>
+              </w:rPr>
+            </w:pPr>
+            <w:r>
+              <w:rPr>
+                <w:b/>
+                <w:bCs/>
+                <w:lang w:eastAsia="zh-CN"/>
+              </w:rPr>
+              <w:t>Impact</w:t>
+            </w:r>
+          </w:p>
+        </w:tc>
+      </w:tr>
+    </w:tbl>
+    <w:p>
+      <w:pPr>
+        <w:rPr>
+          <w:rFonts w:eastAsiaTheme="minorEastAsia" w:hint="eastAsia"/>
+          <w:lang w:eastAsia="zh-CN"/>
+        </w:rPr>
+      </w:pPr>
+    </w:p>
+    <w:p>
+      <w:pPr>
+        <w:pStyle w:val="Heading1withoutnumbering"/>
+      </w:pPr>
+      <w:r>
         <w:t>References</w:t>
       </w:r>
       <w:bookmarkEnd w:id="8"/>
@@ -1212,32 +3188,16 @@
       <w:pPr>
         <w:pStyle w:val="BibItems"/>
         <w:rPr>
-          <w:rFonts w:eastAsiaTheme="minorEastAsia"/>
+          <w:rFonts w:eastAsiaTheme="minorEastAsia" w:hint="eastAsia"/>
           <w:lang w:eastAsia="zh-CN"/>
         </w:rPr>
       </w:pPr>
       <w:r>
         <w:t>[10] Apache Software Foundation. Apache Hive Documentation. https://hive.apache.org/, 2026.</w:t>
       </w:r>
-    </w:p>
-    <w:p>
-      <w:pPr>
-        <w:spacing w:before="0" w:after="200" w:line="276" w:lineRule="auto"/>
-        <w:jc w:val="left"/>
-        <w:rPr>
-          <w:rFonts w:asciiTheme="minorHAnsi" w:eastAsiaTheme="majorEastAsia" w:hAnsiTheme="minorHAnsi" w:cstheme="minorHAnsi"/>
-          <w:b/>
-          <w:bCs/>
-          <w:sz w:val="32"/>
-          <w:szCs w:val="28"/>
-        </w:rPr>
-      </w:pPr>
       <w:bookmarkStart w:id="9" w:name="_Toc167888730"/>
       <w:bookmarkStart w:id="10" w:name="_Toc425869970"/>
       <w:bookmarkStart w:id="11" w:name="_Toc14275718"/>
-      <w:r>
-        <w:br w:type="page"/>
-      </w:r>
     </w:p>
     <w:p>
       <w:pPr>
@@ -1322,26 +3282,74 @@
             <w:pPr>
               <w:pStyle w:val="NoSpacing"/>
               <w:rPr>
+                <w:rFonts w:eastAsiaTheme="minorEastAsia"/>
+                <w:lang w:eastAsia="zh-CN"/>
+              </w:rPr>
+            </w:pPr>
+            <w:r>
+              <w:rPr>
                 <w:rFonts w:eastAsiaTheme="minorEastAsia" w:hint="eastAsia"/>
                 <w:lang w:eastAsia="zh-CN"/>
               </w:rPr>
-            </w:pPr>
+              <w:t xml:space="preserve">Sun </w:t>
+            </w:r>
+            <w:proofErr w:type="spellStart"/>
             <w:r>
               <w:rPr>
                 <w:rFonts w:eastAsiaTheme="minorEastAsia" w:hint="eastAsia"/>
                 <w:lang w:eastAsia="zh-CN"/>
               </w:rPr>
-              <w:t xml:space="preserve">Sun </w:t>
-            </w:r>
-            <w:proofErr w:type="spellStart"/>
+              <w:t>WenBin</w:t>
+            </w:r>
+            <w:proofErr w:type="spellEnd"/>
+          </w:p>
+        </w:tc>
+      </w:tr>
+      <w:tr>
+        <w:tc>
+          <w:tcPr>
+            <w:tcW w:w="3295" w:type="dxa"/>
+          </w:tcPr>
+          <w:p>
+            <w:pPr>
+              <w:pStyle w:val="NoSpacing"/>
+            </w:pPr>
+            <w:r>
+              <w:rPr>
+                <w:b/>
+                <w:bCs/>
+              </w:rPr>
+              <w:t>Student number</w:t>
+            </w:r>
+            <w:r>
+              <w:t>:</w:t>
+            </w:r>
+          </w:p>
+          <w:p>
+            <w:pPr>
+              <w:pStyle w:val="NoSpacing"/>
+            </w:pPr>
+          </w:p>
+        </w:tc>
+        <w:tc>
+          <w:tcPr>
+            <w:tcW w:w="5948" w:type="dxa"/>
+          </w:tcPr>
+          <w:p>
+            <w:pPr>
+              <w:pStyle w:val="NoSpacing"/>
+              <w:rPr>
+                <w:rFonts w:eastAsiaTheme="minorEastAsia"/>
+                <w:lang w:eastAsia="zh-CN"/>
+              </w:rPr>
+            </w:pPr>
             <w:r>
               <w:rPr>
                 <w:rFonts w:eastAsiaTheme="minorEastAsia" w:hint="eastAsia"/>
                 <w:lang w:eastAsia="zh-CN"/>
               </w:rPr>
-              <w:t>WenBin</w:t>
-            </w:r>
-            <w:proofErr w:type="spellEnd"/>
+              <w:t>P2321251</w:t>
+            </w:r>
           </w:p>
         </w:tc>
       </w:tr>
@@ -1359,17 +3367,12 @@
                 <w:b/>
                 <w:bCs/>
               </w:rPr>
-              <w:t>Student number</w:t>
+              <w:t>Programme</w:t>
             </w:r>
             <w:r>
               <w:t>:</w:t>
             </w:r>
           </w:p>
-          <w:p>
-            <w:pPr>
-              <w:pStyle w:val="NoSpacing"/>
-            </w:pPr>
-          </w:p>
         </w:tc>
         <w:tc>
           <w:tcPr>
@@ -1378,17 +3381,48 @@
           <w:p>
             <w:pPr>
               <w:pStyle w:val="NoSpacing"/>
-              <w:rPr>
-                <w:rFonts w:eastAsiaTheme="minorEastAsia" w:hint="eastAsia"/>
-                <w:lang w:eastAsia="zh-CN"/>
-              </w:rPr>
-            </w:pPr>
-            <w:r>
-              <w:rPr>
-                <w:rFonts w:eastAsiaTheme="minorEastAsia" w:hint="eastAsia"/>
-                <w:lang w:eastAsia="zh-CN"/>
-              </w:rPr>
-              <w:t>P2321251</w:t>
+            </w:pPr>
+            <w:r>
+              <w:sym w:font="Wingdings" w:char="F0FE"/>
+            </w:r>
+            <w:r>
+              <w:t xml:space="preserve"> </w:t>
+            </w:r>
+            <w:r>
+              <w:t>BSc</w:t>
+            </w:r>
+            <w:r>
+              <w:t xml:space="preserve"> in Computing                   </w:t>
+            </w:r>
+            <w:r>
+              <w:sym w:font="Wingdings" w:char="F06F"/>
+            </w:r>
+            <w:r>
+              <w:t xml:space="preserve"> </w:t>
+            </w:r>
+            <w:r>
+              <w:t>BSc</w:t>
+            </w:r>
+            <w:r>
+              <w:t xml:space="preserve"> in AI</w:t>
+            </w:r>
+            <w:r>
+              <w:br/>
+            </w:r>
+            <w:r>
+              <w:sym w:font="Wingdings" w:char="F06F"/>
+            </w:r>
+            <w:r>
+              <w:t xml:space="preserve"> MSc in Big Data and IoT</w:t>
+            </w:r>
+            <w:r>
+              <w:br/>
+            </w:r>
+            <w:r>
+              <w:sym w:font="Wingdings" w:char="F06F"/>
+            </w:r>
+            <w:r>
+              <w:t xml:space="preserve"> PhD in Computer Applied Technology</w:t>
             </w:r>
           </w:p>
         </w:tc>
@@ -1407,7 +3441,7 @@
                 <w:b/>
                 <w:bCs/>
               </w:rPr>
-              <w:t>Programme</w:t>
+              <w:t>Module</w:t>
             </w:r>
             <w:r>
               <w:t>:</w:t>
@@ -1423,47 +3457,13 @@
               <w:pStyle w:val="NoSpacing"/>
             </w:pPr>
             <w:r>
-              <w:sym w:font="Wingdings" w:char="F0FE"/>
-            </w:r>
-            <w:r>
-              <w:t xml:space="preserve"> </w:t>
-            </w:r>
-            <w:r>
-              <w:t>BSc</w:t>
-            </w:r>
-            <w:r>
-              <w:t xml:space="preserve"> in Computing                   </w:t>
-            </w:r>
-            <w:r>
-              <w:sym w:font="Wingdings" w:char="F06F"/>
-            </w:r>
-            <w:r>
-              <w:t xml:space="preserve"> </w:t>
-            </w:r>
-            <w:r>
-              <w:t>BSc</w:t>
-            </w:r>
-            <w:r>
-              <w:t xml:space="preserve"> in AI</w:t>
-            </w:r>
-            <w:r>
-              <w:br/>
-            </w:r>
-            <w:r>
-              <w:sym w:font="Wingdings" w:char="F06F"/>
-            </w:r>
-            <w:r>
-              <w:t xml:space="preserve"> MSc in Big Data and IoT</w:t>
-            </w:r>
-            <w:r>
-              <w:br/>
-            </w:r>
-            <w:r>
-              <w:sym w:font="Wingdings" w:char="F06F"/>
-            </w:r>
-            <w:r>
-              <w:t xml:space="preserve"> PhD in Computer Applied Technology</w:t>
-            </w:r>
+              <w:t>Final Year Project</w:t>
+            </w:r>
+          </w:p>
+          <w:p>
+            <w:pPr>
+              <w:pStyle w:val="NoSpacing"/>
+            </w:pPr>
           </w:p>
         </w:tc>
       </w:tr>
@@ -1481,7 +3481,7 @@
                 <w:b/>
                 <w:bCs/>
               </w:rPr>
-              <w:t>Module</w:t>
+              <w:t>Title of project</w:t>
             </w:r>
             <w:r>
               <w:t>:</w:t>
@@ -1495,15 +3495,17 @@
           <w:p>
             <w:pPr>
               <w:pStyle w:val="NoSpacing"/>
-            </w:pPr>
-            <w:r>
-              <w:t>Final Year Project</w:t>
-            </w:r>
-          </w:p>
-          <w:p>
-            <w:pPr>
-              <w:pStyle w:val="NoSpacing"/>
-            </w:pPr>
+              <w:rPr>
+                <w:rFonts w:eastAsiaTheme="minorEastAsia"/>
+                <w:lang w:eastAsia="zh-CN"/>
+              </w:rPr>
+            </w:pPr>
+            <w:r>
+              <w:rPr>
+                <w:lang w:val="en-GB"/>
+              </w:rPr>
+              <w:t>A Low-Cost IoT Environmental Monitoring System for Server Rooms Using Raspberry Pi and DHT22 Sensors</w:t>
+            </w:r>
           </w:p>
         </w:tc>
       </w:tr>
@@ -1521,48 +3523,6 @@
                 <w:b/>
                 <w:bCs/>
               </w:rPr>
-              <w:t>Title of project</w:t>
-            </w:r>
-            <w:r>
-              <w:t>:</w:t>
-            </w:r>
-          </w:p>
-        </w:tc>
-        <w:tc>
-          <w:tcPr>
-            <w:tcW w:w="5948" w:type="dxa"/>
-          </w:tcPr>
-          <w:p>
-            <w:pPr>
-              <w:pStyle w:val="NoSpacing"/>
-              <w:rPr>
-                <w:rFonts w:eastAsiaTheme="minorEastAsia" w:hint="eastAsia"/>
-                <w:lang w:eastAsia="zh-CN"/>
-              </w:rPr>
-            </w:pPr>
-            <w:r>
-              <w:rPr>
-                <w:lang w:val="en-GB"/>
-              </w:rPr>
-              <w:t>A Low-Cost IoT Environmental Monitoring System for Server Rooms Using Raspberry Pi and DHT22 Sensors</w:t>
-            </w:r>
-          </w:p>
-        </w:tc>
-      </w:tr>
-      <w:tr>
-        <w:tc>
-          <w:tcPr>
-            <w:tcW w:w="3295" w:type="dxa"/>
-          </w:tcPr>
-          <w:p>
-            <w:pPr>
-              <w:pStyle w:val="NoSpacing"/>
-            </w:pPr>
-            <w:r>
-              <w:rPr>
-                <w:b/>
-                <w:bCs/>
-              </w:rPr>
               <w:t>Supervisor</w:t>
             </w:r>
             <w:r>
@@ -1590,7 +3550,7 @@
             <w:pPr>
               <w:pStyle w:val="NoSpacing"/>
               <w:rPr>
-                <w:rFonts w:eastAsiaTheme="minorEastAsia" w:hint="eastAsia"/>
+                <w:rFonts w:eastAsiaTheme="minorEastAsia"/>
                 <w:lang w:eastAsia="zh-CN"/>
               </w:rPr>
             </w:pPr>
@@ -1660,7 +3620,7 @@
           <w:p>
             <w:pPr>
               <w:rPr>
-                <w:rFonts w:eastAsiaTheme="minorEastAsia" w:cstheme="minorHAnsi" w:hint="eastAsia"/>
+                <w:rFonts w:eastAsiaTheme="minorEastAsia" w:cstheme="minorHAnsi"/>
                 <w:szCs w:val="22"/>
                 <w:lang w:val="en-US" w:eastAsia="zh-CN"/>
               </w:rPr>
@@ -2064,7 +4024,7 @@
             <w:pPr>
               <w:pStyle w:val="NoSpacing"/>
               <w:rPr>
-                <w:rFonts w:eastAsiaTheme="minorEastAsia" w:hint="eastAsia"/>
+                <w:rFonts w:eastAsiaTheme="minorEastAsia"/>
                 <w:b/>
                 <w:bCs/>
                 <w:lang w:eastAsia="zh-CN"/>
@@ -2137,7 +4097,7 @@
             <w:pPr>
               <w:pStyle w:val="NoSpacing"/>
               <w:rPr>
-                <w:rFonts w:eastAsiaTheme="minorEastAsia" w:hint="eastAsia"/>
+                <w:rFonts w:eastAsiaTheme="minorEastAsia"/>
                 <w:b/>
                 <w:bCs/>
                 <w:lang w:eastAsia="zh-CN"/>
@@ -2210,7 +4170,7 @@
             <w:pPr>
               <w:pStyle w:val="NoSpacing"/>
               <w:rPr>
-                <w:rFonts w:eastAsiaTheme="minorEastAsia" w:hint="eastAsia"/>
+                <w:rFonts w:eastAsiaTheme="minorEastAsia"/>
                 <w:b/>
                 <w:bCs/>
                 <w:lang w:eastAsia="zh-CN"/>
@@ -2852,19 +4812,7 @@
                 <w:lang w:val="en-GB"/>
               </w:rPr>
               <w:lastRenderedPageBreak/>
-              <w:t xml:space="preserve">No ethical issues are identified. The project monitors only physical environmental variables (temperature and humidity) in a server room. It involves no human participants, no personal or </w:t>
-            </w:r>
-            <w:r>
-              <w:rPr>
-                <w:lang w:val="en-GB"/>
-              </w:rPr>
-              <w:t>anonym sable</w:t>
-            </w:r>
-            <w:r>
-              <w:rPr>
-                <w:lang w:val="en-GB"/>
-              </w:rPr>
-              <w:t xml:space="preserve"> data, and no activities that pose risks beyond ordinary study or working life.</w:t>
+              <w:t>No ethical issues are identified. The project monitors only physical environmental variables (temperature and humidity) in a server room. It involves no human participants, no personal or anonym sable data, and no activities that pose risks beyond ordinary study or working life.</w:t>
             </w:r>
           </w:p>
           <w:p>
@@ -2991,7 +4939,7 @@
             <w:pPr>
               <w:pStyle w:val="NoSpacing"/>
               <w:rPr>
-                <w:rFonts w:eastAsiaTheme="minorEastAsia" w:hint="eastAsia"/>
+                <w:rFonts w:eastAsiaTheme="minorEastAsia"/>
                 <w:lang w:eastAsia="zh-CN"/>
               </w:rPr>
             </w:pPr>
@@ -4118,6 +6066,119 @@
     </w:lvl>
   </w:abstractNum>
   <w:abstractNum w:abstractNumId="7" w15:restartNumberingAfterBreak="0">
+    <w:nsid w:val="206C1358"/>
+    <w:multiLevelType w:val="hybridMultilevel"/>
+    <w:tmpl w:val="ADECCDCC"/>
+    <w:lvl w:ilvl="0" w:tplc="04090001">
+      <w:start w:val="1"/>
+      <w:numFmt w:val="bullet"/>
+      <w:lvlText w:val=""/>
+      <w:lvlJc w:val="left"/>
+      <w:pPr>
+        <w:ind w:left="440" w:hanging="440"/>
+      </w:pPr>
+      <w:rPr>
+        <w:rFonts w:ascii="Wingdings" w:hAnsi="Wingdings" w:hint="default"/>
+      </w:rPr>
+    </w:lvl>
+    <w:lvl w:ilvl="1" w:tplc="04090003" w:tentative="1">
+      <w:start w:val="1"/>
+      <w:numFmt w:val="bullet"/>
+      <w:lvlText w:val=""/>
+      <w:lvlJc w:val="left"/>
+      <w:pPr>
+        <w:ind w:left="880" w:hanging="440"/>
+      </w:pPr>
+      <w:rPr>
+        <w:rFonts w:ascii="Wingdings" w:hAnsi="Wingdings" w:hint="default"/>
+      </w:rPr>
+    </w:lvl>
+    <w:lvl w:ilvl="2" w:tplc="04090005" w:tentative="1">
+      <w:start w:val="1"/>
+      <w:numFmt w:val="bullet"/>
+      <w:lvlText w:val=""/>
+      <w:lvlJc w:val="left"/>
+      <w:pPr>
+        <w:ind w:left="1320" w:hanging="440"/>
+      </w:pPr>
+      <w:rPr>
+        <w:rFonts w:ascii="Wingdings" w:hAnsi="Wingdings" w:hint="default"/>
+      </w:rPr>
+    </w:lvl>
+    <w:lvl w:ilvl="3" w:tplc="04090001" w:tentative="1">
+      <w:start w:val="1"/>
+      <w:numFmt w:val="bullet"/>
+      <w:lvlText w:val=""/>
+      <w:lvlJc w:val="left"/>
+      <w:pPr>
+        <w:ind w:left="1760" w:hanging="440"/>
+      </w:pPr>
+      <w:rPr>
+        <w:rFonts w:ascii="Wingdings" w:hAnsi="Wingdings" w:hint="default"/>
+      </w:rPr>
+    </w:lvl>
+    <w:lvl w:ilvl="4" w:tplc="04090003" w:tentative="1">
+      <w:start w:val="1"/>
+      <w:numFmt w:val="bullet"/>
+      <w:lvlText w:val=""/>
+      <w:lvlJc w:val="left"/>
+      <w:pPr>
+        <w:ind w:left="2200" w:hanging="440"/>
+      </w:pPr>
+      <w:rPr>
+        <w:rFonts w:ascii="Wingdings" w:hAnsi="Wingdings" w:hint="default"/>
+      </w:rPr>
+    </w:lvl>
+    <w:lvl w:ilvl="5" w:tplc="04090005" w:tentative="1">
+      <w:start w:val="1"/>
+      <w:numFmt w:val="bullet"/>
+      <w:lvlText w:val=""/>
+      <w:lvlJc w:val="left"/>
+      <w:pPr>
+        <w:ind w:left="2640" w:hanging="440"/>
+      </w:pPr>
+      <w:rPr>
+        <w:rFonts w:ascii="Wingdings" w:hAnsi="Wingdings" w:hint="default"/>
+      </w:rPr>
+    </w:lvl>
+    <w:lvl w:ilvl="6" w:tplc="04090001" w:tentative="1">
+      <w:start w:val="1"/>
+      <w:numFmt w:val="bullet"/>
+      <w:lvlText w:val=""/>
+      <w:lvlJc w:val="left"/>
+      <w:pPr>
+        <w:ind w:left="3080" w:hanging="440"/>
+      </w:pPr>
+      <w:rPr>
+        <w:rFonts w:ascii="Wingdings" w:hAnsi="Wingdings" w:hint="default"/>
+      </w:rPr>
+    </w:lvl>
+    <w:lvl w:ilvl="7" w:tplc="04090003" w:tentative="1">
+      <w:start w:val="1"/>
+      <w:numFmt w:val="bullet"/>
+      <w:lvlText w:val=""/>
+      <w:lvlJc w:val="left"/>
+      <w:pPr>
+        <w:ind w:left="3520" w:hanging="440"/>
+      </w:pPr>
+      <w:rPr>
+        <w:rFonts w:ascii="Wingdings" w:hAnsi="Wingdings" w:hint="default"/>
+      </w:rPr>
+    </w:lvl>
+    <w:lvl w:ilvl="8" w:tplc="04090005" w:tentative="1">
+      <w:start w:val="1"/>
+      <w:numFmt w:val="bullet"/>
+      <w:lvlText w:val=""/>
+      <w:lvlJc w:val="left"/>
+      <w:pPr>
+        <w:ind w:left="3960" w:hanging="440"/>
+      </w:pPr>
+      <w:rPr>
+        <w:rFonts w:ascii="Wingdings" w:hAnsi="Wingdings" w:hint="default"/>
+      </w:rPr>
+    </w:lvl>
+  </w:abstractNum>
+  <w:abstractNum w:abstractNumId="8" w15:restartNumberingAfterBreak="0">
     <w:nsid w:val="22F9549B"/>
     <w:multiLevelType w:val="hybridMultilevel"/>
     <w:tmpl w:val="F5D0F300"/>
@@ -4230,7 +6291,7 @@
       </w:rPr>
     </w:lvl>
   </w:abstractNum>
-  <w:abstractNum w:abstractNumId="8" w15:restartNumberingAfterBreak="0">
+  <w:abstractNum w:abstractNumId="9" w15:restartNumberingAfterBreak="0">
     <w:nsid w:val="23703326"/>
     <w:multiLevelType w:val="hybridMultilevel"/>
     <w:tmpl w:val="DA4660B4"/>
@@ -4343,7 +6404,7 @@
       </w:rPr>
     </w:lvl>
   </w:abstractNum>
-  <w:abstractNum w:abstractNumId="9" w15:restartNumberingAfterBreak="0">
+  <w:abstractNum w:abstractNumId="10" w15:restartNumberingAfterBreak="0">
     <w:nsid w:val="249C3F5D"/>
     <w:multiLevelType w:val="hybridMultilevel"/>
     <w:tmpl w:val="01B0F47A"/>
@@ -4456,7 +6517,120 @@
       </w:rPr>
     </w:lvl>
   </w:abstractNum>
-  <w:abstractNum w:abstractNumId="10" w15:restartNumberingAfterBreak="0">
+  <w:abstractNum w:abstractNumId="11" w15:restartNumberingAfterBreak="0">
+    <w:nsid w:val="284756AC"/>
+    <w:multiLevelType w:val="hybridMultilevel"/>
+    <w:tmpl w:val="751E85B4"/>
+    <w:lvl w:ilvl="0" w:tplc="04090001">
+      <w:start w:val="1"/>
+      <w:numFmt w:val="bullet"/>
+      <w:lvlText w:val=""/>
+      <w:lvlJc w:val="left"/>
+      <w:pPr>
+        <w:ind w:left="440" w:hanging="440"/>
+      </w:pPr>
+      <w:rPr>
+        <w:rFonts w:ascii="Wingdings" w:hAnsi="Wingdings" w:hint="default"/>
+      </w:rPr>
+    </w:lvl>
+    <w:lvl w:ilvl="1" w:tplc="04090003" w:tentative="1">
+      <w:start w:val="1"/>
+      <w:numFmt w:val="bullet"/>
+      <w:lvlText w:val=""/>
+      <w:lvlJc w:val="left"/>
+      <w:pPr>
+        <w:ind w:left="880" w:hanging="440"/>
+      </w:pPr>
+      <w:rPr>
+        <w:rFonts w:ascii="Wingdings" w:hAnsi="Wingdings" w:hint="default"/>
+      </w:rPr>
+    </w:lvl>
+    <w:lvl w:ilvl="2" w:tplc="04090005" w:tentative="1">
+      <w:start w:val="1"/>
+      <w:numFmt w:val="bullet"/>
+      <w:lvlText w:val=""/>
+      <w:lvlJc w:val="left"/>
+      <w:pPr>
+        <w:ind w:left="1320" w:hanging="440"/>
+      </w:pPr>
+      <w:rPr>
+        <w:rFonts w:ascii="Wingdings" w:hAnsi="Wingdings" w:hint="default"/>
+      </w:rPr>
+    </w:lvl>
+    <w:lvl w:ilvl="3" w:tplc="04090001" w:tentative="1">
+      <w:start w:val="1"/>
+      <w:numFmt w:val="bullet"/>
+      <w:lvlText w:val=""/>
+      <w:lvlJc w:val="left"/>
+      <w:pPr>
+        <w:ind w:left="1760" w:hanging="440"/>
+      </w:pPr>
+      <w:rPr>
+        <w:rFonts w:ascii="Wingdings" w:hAnsi="Wingdings" w:hint="default"/>
+      </w:rPr>
+    </w:lvl>
+    <w:lvl w:ilvl="4" w:tplc="04090003" w:tentative="1">
+      <w:start w:val="1"/>
+      <w:numFmt w:val="bullet"/>
+      <w:lvlText w:val=""/>
+      <w:lvlJc w:val="left"/>
+      <w:pPr>
+        <w:ind w:left="2200" w:hanging="440"/>
+      </w:pPr>
+      <w:rPr>
+        <w:rFonts w:ascii="Wingdings" w:hAnsi="Wingdings" w:hint="default"/>
+      </w:rPr>
+    </w:lvl>
+    <w:lvl w:ilvl="5" w:tplc="04090005" w:tentative="1">
+      <w:start w:val="1"/>
+      <w:numFmt w:val="bullet"/>
+      <w:lvlText w:val=""/>
+      <w:lvlJc w:val="left"/>
+      <w:pPr>
+        <w:ind w:left="2640" w:hanging="440"/>
+      </w:pPr>
+      <w:rPr>
+        <w:rFonts w:ascii="Wingdings" w:hAnsi="Wingdings" w:hint="default"/>
+      </w:rPr>
+    </w:lvl>
+    <w:lvl w:ilvl="6" w:tplc="04090001" w:tentative="1">
+      <w:start w:val="1"/>
+      <w:numFmt w:val="bullet"/>
+      <w:lvlText w:val=""/>
+      <w:lvlJc w:val="left"/>
+      <w:pPr>
+        <w:ind w:left="3080" w:hanging="440"/>
+      </w:pPr>
+      <w:rPr>
+        <w:rFonts w:ascii="Wingdings" w:hAnsi="Wingdings" w:hint="default"/>
+      </w:rPr>
+    </w:lvl>
+    <w:lvl w:ilvl="7" w:tplc="04090003" w:tentative="1">
+      <w:start w:val="1"/>
+      <w:numFmt w:val="bullet"/>
+      <w:lvlText w:val=""/>
+      <w:lvlJc w:val="left"/>
+      <w:pPr>
+        <w:ind w:left="3520" w:hanging="440"/>
+      </w:pPr>
+      <w:rPr>
+        <w:rFonts w:ascii="Wingdings" w:hAnsi="Wingdings" w:hint="default"/>
+      </w:rPr>
+    </w:lvl>
+    <w:lvl w:ilvl="8" w:tplc="04090005" w:tentative="1">
+      <w:start w:val="1"/>
+      <w:numFmt w:val="bullet"/>
+      <w:lvlText w:val=""/>
+      <w:lvlJc w:val="left"/>
+      <w:pPr>
+        <w:ind w:left="3960" w:hanging="440"/>
+      </w:pPr>
+      <w:rPr>
+        <w:rFonts w:ascii="Wingdings" w:hAnsi="Wingdings" w:hint="default"/>
+      </w:rPr>
+    </w:lvl>
+  </w:abstractNum>
+  <w:abstractNum w:abstractNumId="12" w15:restartNumberingAfterBreak="0">
     <w:nsid w:val="2F5455BE"/>
     <w:multiLevelType w:val="hybridMultilevel"/>
     <w:tmpl w:val="66B6B8F6"/>
@@ -4569,7 +6743,7 @@
       </w:rPr>
     </w:lvl>
   </w:abstractNum>
-  <w:abstractNum w:abstractNumId="11" w15:restartNumberingAfterBreak="0">
+  <w:abstractNum w:abstractNumId="13" w15:restartNumberingAfterBreak="0">
     <w:nsid w:val="30E15D25"/>
     <w:multiLevelType w:val="hybridMultilevel"/>
     <w:tmpl w:val="337CA26E"/>
@@ -4682,7 +6856,7 @@
       </w:rPr>
     </w:lvl>
   </w:abstractNum>
-  <w:abstractNum w:abstractNumId="12" w15:restartNumberingAfterBreak="0">
+  <w:abstractNum w:abstractNumId="14" w15:restartNumberingAfterBreak="0">
     <w:nsid w:val="324A70AD"/>
     <w:multiLevelType w:val="hybridMultilevel"/>
     <w:tmpl w:val="BA7CC126"/>
@@ -4795,7 +6969,7 @@
       </w:rPr>
     </w:lvl>
   </w:abstractNum>
-  <w:abstractNum w:abstractNumId="13" w15:restartNumberingAfterBreak="0">
+  <w:abstractNum w:abstractNumId="15" w15:restartNumberingAfterBreak="0">
     <w:nsid w:val="33E92F30"/>
     <w:multiLevelType w:val="hybridMultilevel"/>
     <w:tmpl w:val="E5AEC0A2"/>
@@ -4908,7 +7082,233 @@
       </w:rPr>
     </w:lvl>
   </w:abstractNum>
-  <w:abstractNum w:abstractNumId="14" w15:restartNumberingAfterBreak="0">
+  <w:abstractNum w:abstractNumId="16" w15:restartNumberingAfterBreak="0">
+    <w:nsid w:val="3AF20AA3"/>
+    <w:multiLevelType w:val="hybridMultilevel"/>
+    <w:tmpl w:val="60900876"/>
+    <w:lvl w:ilvl="0" w:tplc="04090001">
+      <w:start w:val="1"/>
+      <w:numFmt w:val="bullet"/>
+      <w:lvlText w:val=""/>
+      <w:lvlJc w:val="left"/>
+      <w:pPr>
+        <w:ind w:left="440" w:hanging="440"/>
+      </w:pPr>
+      <w:rPr>
+        <w:rFonts w:ascii="Wingdings" w:hAnsi="Wingdings" w:hint="default"/>
+      </w:rPr>
+    </w:lvl>
+    <w:lvl w:ilvl="1" w:tplc="04090003" w:tentative="1">
+      <w:start w:val="1"/>
+      <w:numFmt w:val="bullet"/>
+      <w:lvlText w:val=""/>
+      <w:lvlJc w:val="left"/>
+      <w:pPr>
+        <w:ind w:left="880" w:hanging="440"/>
+      </w:pPr>
+      <w:rPr>
+        <w:rFonts w:ascii="Wingdings" w:hAnsi="Wingdings" w:hint="default"/>
+      </w:rPr>
+    </w:lvl>
+    <w:lvl w:ilvl="2" w:tplc="04090005" w:tentative="1">
+      <w:start w:val="1"/>
+      <w:numFmt w:val="bullet"/>
+      <w:lvlText w:val=""/>
+      <w:lvlJc w:val="left"/>
+      <w:pPr>
+        <w:ind w:left="1320" w:hanging="440"/>
+      </w:pPr>
+      <w:rPr>
+        <w:rFonts w:ascii="Wingdings" w:hAnsi="Wingdings" w:hint="default"/>
+      </w:rPr>
+    </w:lvl>
+    <w:lvl w:ilvl="3" w:tplc="04090001" w:tentative="1">
+      <w:start w:val="1"/>
+      <w:numFmt w:val="bullet"/>
+      <w:lvlText w:val=""/>
+      <w:lvlJc w:val="left"/>
+      <w:pPr>
+        <w:ind w:left="1760" w:hanging="440"/>
+      </w:pPr>
+      <w:rPr>
+        <w:rFonts w:ascii="Wingdings" w:hAnsi="Wingdings" w:hint="default"/>
+      </w:rPr>
+    </w:lvl>
+    <w:lvl w:ilvl="4" w:tplc="04090003" w:tentative="1">
+      <w:start w:val="1"/>
+      <w:numFmt w:val="bullet"/>
+      <w:lvlText w:val=""/>
+      <w:lvlJc w:val="left"/>
+      <w:pPr>
+        <w:ind w:left="2200" w:hanging="440"/>
+      </w:pPr>
+      <w:rPr>
+        <w:rFonts w:ascii="Wingdings" w:hAnsi="Wingdings" w:hint="default"/>
+      </w:rPr>
+    </w:lvl>
+    <w:lvl w:ilvl="5" w:tplc="04090005" w:tentative="1">
+      <w:start w:val="1"/>
+      <w:numFmt w:val="bullet"/>
+      <w:lvlText w:val=""/>
+      <w:lvlJc w:val="left"/>
+      <w:pPr>
+        <w:ind w:left="2640" w:hanging="440"/>
+      </w:pPr>
+      <w:rPr>
+        <w:rFonts w:ascii="Wingdings" w:hAnsi="Wingdings" w:hint="default"/>
+      </w:rPr>
+    </w:lvl>
+    <w:lvl w:ilvl="6" w:tplc="04090001" w:tentative="1">
+      <w:start w:val="1"/>
+      <w:numFmt w:val="bullet"/>
+      <w:lvlText w:val=""/>
+      <w:lvlJc w:val="left"/>
+      <w:pPr>
+        <w:ind w:left="3080" w:hanging="440"/>
+      </w:pPr>
+      <w:rPr>
+        <w:rFonts w:ascii="Wingdings" w:hAnsi="Wingdings" w:hint="default"/>
+      </w:rPr>
+    </w:lvl>
+    <w:lvl w:ilvl="7" w:tplc="04090003" w:tentative="1">
+      <w:start w:val="1"/>
+      <w:numFmt w:val="bullet"/>
+      <w:lvlText w:val=""/>
+      <w:lvlJc w:val="left"/>
+      <w:pPr>
+        <w:ind w:left="3520" w:hanging="440"/>
+      </w:pPr>
+      <w:rPr>
+        <w:rFonts w:ascii="Wingdings" w:hAnsi="Wingdings" w:hint="default"/>
+      </w:rPr>
+    </w:lvl>
+    <w:lvl w:ilvl="8" w:tplc="04090005" w:tentative="1">
+      <w:start w:val="1"/>
+      <w:numFmt w:val="bullet"/>
+      <w:lvlText w:val=""/>
+      <w:lvlJc w:val="left"/>
+      <w:pPr>
+        <w:ind w:left="3960" w:hanging="440"/>
+      </w:pPr>
+      <w:rPr>
+        <w:rFonts w:ascii="Wingdings" w:hAnsi="Wingdings" w:hint="default"/>
+      </w:rPr>
+    </w:lvl>
+  </w:abstractNum>
+  <w:abstractNum w:abstractNumId="17" w15:restartNumberingAfterBreak="0">
+    <w:nsid w:val="3B9C130D"/>
+    <w:multiLevelType w:val="hybridMultilevel"/>
+    <w:tmpl w:val="0E6E09D8"/>
+    <w:lvl w:ilvl="0" w:tplc="04090001">
+      <w:start w:val="1"/>
+      <w:numFmt w:val="bullet"/>
+      <w:lvlText w:val=""/>
+      <w:lvlJc w:val="left"/>
+      <w:pPr>
+        <w:ind w:left="440" w:hanging="440"/>
+      </w:pPr>
+      <w:rPr>
+        <w:rFonts w:ascii="Wingdings" w:hAnsi="Wingdings" w:hint="default"/>
+      </w:rPr>
+    </w:lvl>
+    <w:lvl w:ilvl="1" w:tplc="04090003" w:tentative="1">
+      <w:start w:val="1"/>
+      <w:numFmt w:val="bullet"/>
+      <w:lvlText w:val=""/>
+      <w:lvlJc w:val="left"/>
+      <w:pPr>
+        <w:ind w:left="880" w:hanging="440"/>
+      </w:pPr>
+      <w:rPr>
+        <w:rFonts w:ascii="Wingdings" w:hAnsi="Wingdings" w:hint="default"/>
+      </w:rPr>
+    </w:lvl>
+    <w:lvl w:ilvl="2" w:tplc="04090005" w:tentative="1">
+      <w:start w:val="1"/>
+      <w:numFmt w:val="bullet"/>
+      <w:lvlText w:val=""/>
+      <w:lvlJc w:val="left"/>
+      <w:pPr>
+        <w:ind w:left="1320" w:hanging="440"/>
+      </w:pPr>
+      <w:rPr>
+        <w:rFonts w:ascii="Wingdings" w:hAnsi="Wingdings" w:hint="default"/>
+      </w:rPr>
+    </w:lvl>
+    <w:lvl w:ilvl="3" w:tplc="04090001" w:tentative="1">
+      <w:start w:val="1"/>
+      <w:numFmt w:val="bullet"/>
+      <w:lvlText w:val=""/>
+      <w:lvlJc w:val="left"/>
+      <w:pPr>
+        <w:ind w:left="1760" w:hanging="440"/>
+      </w:pPr>
+      <w:rPr>
+        <w:rFonts w:ascii="Wingdings" w:hAnsi="Wingdings" w:hint="default"/>
+      </w:rPr>
+    </w:lvl>
+    <w:lvl w:ilvl="4" w:tplc="04090003" w:tentative="1">
+      <w:start w:val="1"/>
+      <w:numFmt w:val="bullet"/>
+      <w:lvlText w:val=""/>
+      <w:lvlJc w:val="left"/>
+      <w:pPr>
+        <w:ind w:left="2200" w:hanging="440"/>
+      </w:pPr>
+      <w:rPr>
+        <w:rFonts w:ascii="Wingdings" w:hAnsi="Wingdings" w:hint="default"/>
+      </w:rPr>
+    </w:lvl>
+    <w:lvl w:ilvl="5" w:tplc="04090005" w:tentative="1">
+      <w:start w:val="1"/>
+      <w:numFmt w:val="bullet"/>
+      <w:lvlText w:val=""/>
+      <w:lvlJc w:val="left"/>
+      <w:pPr>
+        <w:ind w:left="2640" w:hanging="440"/>
+      </w:pPr>
+      <w:rPr>
+        <w:rFonts w:ascii="Wingdings" w:hAnsi="Wingdings" w:hint="default"/>
+      </w:rPr>
+    </w:lvl>
+    <w:lvl w:ilvl="6" w:tplc="04090001" w:tentative="1">
+      <w:start w:val="1"/>
+      <w:numFmt w:val="bullet"/>
+      <w:lvlText w:val=""/>
+      <w:lvlJc w:val="left"/>
+      <w:pPr>
+        <w:ind w:left="3080" w:hanging="440"/>
+      </w:pPr>
+      <w:rPr>
+        <w:rFonts w:ascii="Wingdings" w:hAnsi="Wingdings" w:hint="default"/>
+      </w:rPr>
+    </w:lvl>
+    <w:lvl w:ilvl="7" w:tplc="04090003" w:tentative="1">
+      <w:start w:val="1"/>
+      <w:numFmt w:val="bullet"/>
+      <w:lvlText w:val=""/>
+      <w:lvlJc w:val="left"/>
+      <w:pPr>
+        <w:ind w:left="3520" w:hanging="440"/>
+      </w:pPr>
+      <w:rPr>
+        <w:rFonts w:ascii="Wingdings" w:hAnsi="Wingdings" w:hint="default"/>
+      </w:rPr>
+    </w:lvl>
+    <w:lvl w:ilvl="8" w:tplc="04090005" w:tentative="1">
+      <w:start w:val="1"/>
+      <w:numFmt w:val="bullet"/>
+      <w:lvlText w:val=""/>
+      <w:lvlJc w:val="left"/>
+      <w:pPr>
+        <w:ind w:left="3960" w:hanging="440"/>
+      </w:pPr>
+      <w:rPr>
+        <w:rFonts w:ascii="Wingdings" w:hAnsi="Wingdings" w:hint="default"/>
+      </w:rPr>
+    </w:lvl>
+  </w:abstractNum>
+  <w:abstractNum w:abstractNumId="18" w15:restartNumberingAfterBreak="0">
     <w:nsid w:val="3F171A3F"/>
     <w:multiLevelType w:val="hybridMultilevel"/>
     <w:tmpl w:val="357A1072"/>
@@ -5021,7 +7421,7 @@
       </w:rPr>
     </w:lvl>
   </w:abstractNum>
-  <w:abstractNum w:abstractNumId="15" w15:restartNumberingAfterBreak="0">
+  <w:abstractNum w:abstractNumId="19" w15:restartNumberingAfterBreak="0">
     <w:nsid w:val="458C446D"/>
     <w:multiLevelType w:val="hybridMultilevel"/>
     <w:tmpl w:val="7C9259E6"/>
@@ -5134,7 +7534,7 @@
       </w:rPr>
     </w:lvl>
   </w:abstractNum>
-  <w:abstractNum w:abstractNumId="16" w15:restartNumberingAfterBreak="0">
+  <w:abstractNum w:abstractNumId="20" w15:restartNumberingAfterBreak="0">
     <w:nsid w:val="468B0DD6"/>
     <w:multiLevelType w:val="hybridMultilevel"/>
     <w:tmpl w:val="E47049AC"/>
@@ -5247,7 +7647,7 @@
       </w:rPr>
     </w:lvl>
   </w:abstractNum>
-  <w:abstractNum w:abstractNumId="17" w15:restartNumberingAfterBreak="0">
+  <w:abstractNum w:abstractNumId="21" w15:restartNumberingAfterBreak="0">
     <w:nsid w:val="46E50C1B"/>
     <w:multiLevelType w:val="hybridMultilevel"/>
     <w:tmpl w:val="1812A9D4"/>
@@ -5360,7 +7760,120 @@
       </w:rPr>
     </w:lvl>
   </w:abstractNum>
-  <w:abstractNum w:abstractNumId="18" w15:restartNumberingAfterBreak="0">
+  <w:abstractNum w:abstractNumId="22" w15:restartNumberingAfterBreak="0">
+    <w:nsid w:val="528E67D3"/>
+    <w:multiLevelType w:val="hybridMultilevel"/>
+    <w:tmpl w:val="CD56F162"/>
+    <w:lvl w:ilvl="0" w:tplc="04090001">
+      <w:start w:val="1"/>
+      <w:numFmt w:val="bullet"/>
+      <w:lvlText w:val=""/>
+      <w:lvlJc w:val="left"/>
+      <w:pPr>
+        <w:ind w:left="440" w:hanging="440"/>
+      </w:pPr>
+      <w:rPr>
+        <w:rFonts w:ascii="Wingdings" w:hAnsi="Wingdings" w:hint="default"/>
+      </w:rPr>
+    </w:lvl>
+    <w:lvl w:ilvl="1" w:tplc="04090003" w:tentative="1">
+      <w:start w:val="1"/>
+      <w:numFmt w:val="bullet"/>
+      <w:lvlText w:val=""/>
+      <w:lvlJc w:val="left"/>
+      <w:pPr>
+        <w:ind w:left="880" w:hanging="440"/>
+      </w:pPr>
+      <w:rPr>
+        <w:rFonts w:ascii="Wingdings" w:hAnsi="Wingdings" w:hint="default"/>
+      </w:rPr>
+    </w:lvl>
+    <w:lvl w:ilvl="2" w:tplc="04090005" w:tentative="1">
+      <w:start w:val="1"/>
+      <w:numFmt w:val="bullet"/>
+      <w:lvlText w:val=""/>
+      <w:lvlJc w:val="left"/>
+      <w:pPr>
+        <w:ind w:left="1320" w:hanging="440"/>
+      </w:pPr>
+      <w:rPr>
+        <w:rFonts w:ascii="Wingdings" w:hAnsi="Wingdings" w:hint="default"/>
+      </w:rPr>
+    </w:lvl>
+    <w:lvl w:ilvl="3" w:tplc="04090001" w:tentative="1">
+      <w:start w:val="1"/>
+      <w:numFmt w:val="bullet"/>
+      <w:lvlText w:val=""/>
+      <w:lvlJc w:val="left"/>
+      <w:pPr>
+        <w:ind w:left="1760" w:hanging="440"/>
+      </w:pPr>
+      <w:rPr>
+        <w:rFonts w:ascii="Wingdings" w:hAnsi="Wingdings" w:hint="default"/>
+      </w:rPr>
+    </w:lvl>
+    <w:lvl w:ilvl="4" w:tplc="04090003" w:tentative="1">
+      <w:start w:val="1"/>
+      <w:numFmt w:val="bullet"/>
+      <w:lvlText w:val=""/>
+      <w:lvlJc w:val="left"/>
+      <w:pPr>
+        <w:ind w:left="2200" w:hanging="440"/>
+      </w:pPr>
+      <w:rPr>
+        <w:rFonts w:ascii="Wingdings" w:hAnsi="Wingdings" w:hint="default"/>
+      </w:rPr>
+    </w:lvl>
+    <w:lvl w:ilvl="5" w:tplc="04090005" w:tentative="1">
+      <w:start w:val="1"/>
+      <w:numFmt w:val="bullet"/>
+      <w:lvlText w:val=""/>
+      <w:lvlJc w:val="left"/>
+      <w:pPr>
+        <w:ind w:left="2640" w:hanging="440"/>
+      </w:pPr>
+      <w:rPr>
+        <w:rFonts w:ascii="Wingdings" w:hAnsi="Wingdings" w:hint="default"/>
+      </w:rPr>
+    </w:lvl>
+    <w:lvl w:ilvl="6" w:tplc="04090001" w:tentative="1">
+      <w:start w:val="1"/>
+      <w:numFmt w:val="bullet"/>
+      <w:lvlText w:val=""/>
+      <w:lvlJc w:val="left"/>
+      <w:pPr>
+        <w:ind w:left="3080" w:hanging="440"/>
+      </w:pPr>
+      <w:rPr>
+        <w:rFonts w:ascii="Wingdings" w:hAnsi="Wingdings" w:hint="default"/>
+      </w:rPr>
+    </w:lvl>
+    <w:lvl w:ilvl="7" w:tplc="04090003" w:tentative="1">
+      <w:start w:val="1"/>
+      <w:numFmt w:val="bullet"/>
+      <w:lvlText w:val=""/>
+      <w:lvlJc w:val="left"/>
+      <w:pPr>
+        <w:ind w:left="3520" w:hanging="440"/>
+      </w:pPr>
+      <w:rPr>
+        <w:rFonts w:ascii="Wingdings" w:hAnsi="Wingdings" w:hint="default"/>
+      </w:rPr>
+    </w:lvl>
+    <w:lvl w:ilvl="8" w:tplc="04090005" w:tentative="1">
+      <w:start w:val="1"/>
+      <w:numFmt w:val="bullet"/>
+      <w:lvlText w:val=""/>
+      <w:lvlJc w:val="left"/>
+      <w:pPr>
+        <w:ind w:left="3960" w:hanging="440"/>
+      </w:pPr>
+      <w:rPr>
+        <w:rFonts w:ascii="Wingdings" w:hAnsi="Wingdings" w:hint="default"/>
+      </w:rPr>
+    </w:lvl>
+  </w:abstractNum>
+  <w:abstractNum w:abstractNumId="23" w15:restartNumberingAfterBreak="0">
     <w:nsid w:val="55822EC7"/>
     <w:multiLevelType w:val="multilevel"/>
     <w:tmpl w:val="ACA25682"/>
@@ -5455,7 +7968,7 @@
       </w:pPr>
     </w:lvl>
   </w:abstractNum>
-  <w:abstractNum w:abstractNumId="19" w15:restartNumberingAfterBreak="0">
+  <w:abstractNum w:abstractNumId="24" w15:restartNumberingAfterBreak="0">
     <w:nsid w:val="57E5355B"/>
     <w:multiLevelType w:val="hybridMultilevel"/>
     <w:tmpl w:val="5DA4F996"/>
@@ -5568,7 +8081,7 @@
       </w:rPr>
     </w:lvl>
   </w:abstractNum>
-  <w:abstractNum w:abstractNumId="20" w15:restartNumberingAfterBreak="0">
+  <w:abstractNum w:abstractNumId="25" w15:restartNumberingAfterBreak="0">
     <w:nsid w:val="5D5F56FD"/>
     <w:multiLevelType w:val="hybridMultilevel"/>
     <w:tmpl w:val="F586B03C"/>
@@ -5681,7 +8194,7 @@
       </w:rPr>
     </w:lvl>
   </w:abstractNum>
-  <w:abstractNum w:abstractNumId="21" w15:restartNumberingAfterBreak="0">
+  <w:abstractNum w:abstractNumId="26" w15:restartNumberingAfterBreak="0">
     <w:nsid w:val="636605F9"/>
     <w:multiLevelType w:val="hybridMultilevel"/>
     <w:tmpl w:val="862E01E6"/>
@@ -5794,7 +8307,7 @@
       </w:rPr>
     </w:lvl>
   </w:abstractNum>
-  <w:abstractNum w:abstractNumId="22" w15:restartNumberingAfterBreak="0">
+  <w:abstractNum w:abstractNumId="27" w15:restartNumberingAfterBreak="0">
     <w:nsid w:val="673238DA"/>
     <w:multiLevelType w:val="hybridMultilevel"/>
     <w:tmpl w:val="81749D7C"/>
@@ -5907,7 +8420,7 @@
       </w:rPr>
     </w:lvl>
   </w:abstractNum>
-  <w:abstractNum w:abstractNumId="23" w15:restartNumberingAfterBreak="0">
+  <w:abstractNum w:abstractNumId="28" w15:restartNumberingAfterBreak="0">
     <w:nsid w:val="699A7AC3"/>
     <w:multiLevelType w:val="hybridMultilevel"/>
     <w:tmpl w:val="CE94A4BA"/>
@@ -6020,7 +8533,7 @@
       </w:rPr>
     </w:lvl>
   </w:abstractNum>
-  <w:abstractNum w:abstractNumId="24" w15:restartNumberingAfterBreak="0">
+  <w:abstractNum w:abstractNumId="29" w15:restartNumberingAfterBreak="0">
     <w:nsid w:val="71866522"/>
     <w:multiLevelType w:val="hybridMultilevel"/>
     <w:tmpl w:val="50EAAA16"/>
@@ -6133,7 +8646,7 @@
       </w:rPr>
     </w:lvl>
   </w:abstractNum>
-  <w:abstractNum w:abstractNumId="25" w15:restartNumberingAfterBreak="0">
+  <w:abstractNum w:abstractNumId="30" w15:restartNumberingAfterBreak="0">
     <w:nsid w:val="791D30FF"/>
     <w:multiLevelType w:val="hybridMultilevel"/>
     <w:tmpl w:val="E65ACF96"/>
@@ -6246,7 +8759,7 @@
       </w:rPr>
     </w:lvl>
   </w:abstractNum>
-  <w:abstractNum w:abstractNumId="26" w15:restartNumberingAfterBreak="0">
+  <w:abstractNum w:abstractNumId="31" w15:restartNumberingAfterBreak="0">
     <w:nsid w:val="7B2A50DB"/>
     <w:multiLevelType w:val="hybridMultilevel"/>
     <w:tmpl w:val="649AD798"/>
@@ -6359,7 +8872,7 @@
       </w:rPr>
     </w:lvl>
   </w:abstractNum>
-  <w:abstractNum w:abstractNumId="27" w15:restartNumberingAfterBreak="0">
+  <w:abstractNum w:abstractNumId="32" w15:restartNumberingAfterBreak="0">
     <w:nsid w:val="7E89177D"/>
     <w:multiLevelType w:val="hybridMultilevel"/>
     <w:tmpl w:val="71F8AB38"/>
@@ -6473,22 +8986,22 @@
     </w:lvl>
   </w:abstractNum>
   <w:num w:numId="1" w16cid:durableId="294528397">
-    <w:abstractNumId w:val="18"/>
+    <w:abstractNumId w:val="23"/>
   </w:num>
   <w:num w:numId="2" w16cid:durableId="1335914059">
-    <w:abstractNumId w:val="11"/>
+    <w:abstractNumId w:val="13"/>
   </w:num>
   <w:num w:numId="3" w16cid:durableId="116605299">
-    <w:abstractNumId w:val="26"/>
+    <w:abstractNumId w:val="31"/>
   </w:num>
   <w:num w:numId="4" w16cid:durableId="2061588511">
-    <w:abstractNumId w:val="17"/>
+    <w:abstractNumId w:val="21"/>
   </w:num>
   <w:num w:numId="5" w16cid:durableId="1499729233">
     <w:abstractNumId w:val="3"/>
   </w:num>
   <w:num w:numId="6" w16cid:durableId="1538086668">
-    <w:abstractNumId w:val="12"/>
+    <w:abstractNumId w:val="14"/>
   </w:num>
   <w:num w:numId="7" w16cid:durableId="278148916">
     <w:abstractNumId w:val="5"/>
@@ -6497,43 +9010,43 @@
     <w:abstractNumId w:val="1"/>
   </w:num>
   <w:num w:numId="9" w16cid:durableId="2022271620">
-    <w:abstractNumId w:val="20"/>
+    <w:abstractNumId w:val="25"/>
   </w:num>
   <w:num w:numId="10" w16cid:durableId="958998947">
     <w:abstractNumId w:val="4"/>
   </w:num>
   <w:num w:numId="11" w16cid:durableId="96755859">
-    <w:abstractNumId w:val="21"/>
+    <w:abstractNumId w:val="26"/>
   </w:num>
   <w:num w:numId="12" w16cid:durableId="303580996">
-    <w:abstractNumId w:val="9"/>
+    <w:abstractNumId w:val="10"/>
   </w:num>
   <w:num w:numId="13" w16cid:durableId="1909804271">
-    <w:abstractNumId w:val="23"/>
+    <w:abstractNumId w:val="28"/>
   </w:num>
   <w:num w:numId="14" w16cid:durableId="1781946387">
-    <w:abstractNumId w:val="15"/>
+    <w:abstractNumId w:val="19"/>
   </w:num>
   <w:num w:numId="15" w16cid:durableId="811213162">
-    <w:abstractNumId w:val="22"/>
+    <w:abstractNumId w:val="27"/>
   </w:num>
   <w:num w:numId="16" w16cid:durableId="948901180">
     <w:abstractNumId w:val="6"/>
   </w:num>
   <w:num w:numId="17" w16cid:durableId="512231613">
-    <w:abstractNumId w:val="13"/>
+    <w:abstractNumId w:val="15"/>
   </w:num>
   <w:num w:numId="18" w16cid:durableId="1884562402">
-    <w:abstractNumId w:val="24"/>
+    <w:abstractNumId w:val="29"/>
   </w:num>
   <w:num w:numId="19" w16cid:durableId="1741714749">
-    <w:abstractNumId w:val="7"/>
+    <w:abstractNumId w:val="8"/>
   </w:num>
   <w:num w:numId="20" w16cid:durableId="1101336280">
-    <w:abstractNumId w:val="10"/>
+    <w:abstractNumId w:val="12"/>
   </w:num>
   <w:num w:numId="21" w16cid:durableId="131022267">
-    <w:abstractNumId w:val="25"/>
+    <w:abstractNumId w:val="30"/>
   </w:num>
   <w:num w:numId="22" w16cid:durableId="902832717">
     <w:abstractNumId w:val="2"/>
@@ -6542,19 +9055,34 @@
     <w:abstractNumId w:val="0"/>
   </w:num>
   <w:num w:numId="24" w16cid:durableId="2033530784">
-    <w:abstractNumId w:val="8"/>
+    <w:abstractNumId w:val="9"/>
   </w:num>
   <w:num w:numId="25" w16cid:durableId="1972401762">
+    <w:abstractNumId w:val="20"/>
+  </w:num>
+  <w:num w:numId="26" w16cid:durableId="344865579">
+    <w:abstractNumId w:val="24"/>
+  </w:num>
+  <w:num w:numId="27" w16cid:durableId="1188563184">
+    <w:abstractNumId w:val="18"/>
+  </w:num>
+  <w:num w:numId="28" w16cid:durableId="2115007665">
+    <w:abstractNumId w:val="32"/>
+  </w:num>
+  <w:num w:numId="29" w16cid:durableId="1632785888">
+    <w:abstractNumId w:val="17"/>
+  </w:num>
+  <w:num w:numId="30" w16cid:durableId="264390717">
+    <w:abstractNumId w:val="7"/>
+  </w:num>
+  <w:num w:numId="31" w16cid:durableId="1742825193">
     <w:abstractNumId w:val="16"/>
   </w:num>
-  <w:num w:numId="26" w16cid:durableId="344865579">
-    <w:abstractNumId w:val="19"/>
+  <w:num w:numId="32" w16cid:durableId="1846364023">
+    <w:abstractNumId w:val="22"/>
   </w:num>
-  <w:num w:numId="27" w16cid:durableId="1188563184">
-    <w:abstractNumId w:val="14"/>
-  </w:num>
-  <w:num w:numId="28" w16cid:durableId="2115007665">
-    <w:abstractNumId w:val="27"/>
+  <w:num w:numId="33" w16cid:durableId="270943086">
+    <w:abstractNumId w:val="11"/>
   </w:num>
   <w:numIdMacAtCleanup w:val="6"/>
 </w:numbering>
@@ -7202,6 +9730,7 @@
   <w:style w:type="character" w:default="1" w:styleId="DefaultParagraphFont">
     <w:name w:val="Default Paragraph Font"/>
     <w:uiPriority w:val="1"/>
+    <w:semiHidden/>
     <w:unhideWhenUsed/>
   </w:style>
   <w:style w:type="table" w:default="1" w:styleId="TableNormal">

</xml_diff>

<commit_message>
Add data-flow diagram to proposal and keep PNG asset
</commit_message>
<xml_diff>
--- a/FYP Proposal P2321251Sun WenBin.docx
+++ b/FYP Proposal P2321251Sun WenBin.docx
@@ -935,6 +935,57 @@
       <w:proofErr w:type="spellEnd"/>
       <w:r>
         <w:t>) DHT22 sensor reliability, since the sensor occasionally returns invalid reads that must be detected and retried; (ii) meeting the ≥99 % capture target, which requires local buffering and re-transmission when the network link between the Raspberry Pi and the server is temporarily unavailable; (iii) real-time alert latency, because threshold checking must be performed at the point of ingestion for alerts to fire within 10 seconds; (iv) query performance, which depends on indexes and pre-aggregation to keep 30-day queries and CSV exports within the stated time limits; and (v) hardware-dependent issues such as sensor calibration and accuracy verification in a real environment.</w:t>
+      </w:r>
+    </w:p>
+    <w:p>
+      <w:pPr>
+        <w:jc w:val="center"/>
+      </w:pPr>
+      <w:r>
+        <w:rPr>
+          <w:i/>
+          <w:sz w:val="23"/>
+        </w:rPr>
+        <w:t>Figure: Overall data flow from sensors to the frontend dashboard.</w:t>
+      </w:r>
+    </w:p>
+    <w:p>
+      <w:pPr>
+        <w:jc w:val="center"/>
+      </w:pPr>
+      <w:r>
+        <w:drawing>
+          <wp:inline xmlns:a="http://schemas.openxmlformats.org/drawingml/2006/main" xmlns:pic="http://schemas.openxmlformats.org/drawingml/2006/picture">
+            <wp:extent cx="5400000" cy="3113265"/>
+            <wp:docPr id="2" name="Picture 2"/>
+            <wp:cNvGraphicFramePr>
+              <a:graphicFrameLocks noChangeAspect="1"/>
+            </wp:cNvGraphicFramePr>
+            <a:graphic>
+              <a:graphicData uri="http://schemas.openxmlformats.org/drawingml/2006/picture">
+                <pic:pic>
+                  <pic:nvPicPr>
+                    <pic:cNvPr id="0" name="diagram.png"/>
+                    <pic:cNvPicPr/>
+                  </pic:nvPicPr>
+                  <pic:blipFill>
+                    <a:blip r:embed="rId19"/>
+                    <a:stretch>
+                      <a:fillRect/>
+                    </a:stretch>
+                  </pic:blipFill>
+                  <pic:spPr>
+                    <a:xfrm>
+                      <a:off x="0" y="0"/>
+                      <a:ext cx="5400000" cy="3113265"/>
+                    </a:xfrm>
+                    <a:prstGeom prst="rect"/>
+                  </pic:spPr>
+                </pic:pic>
+              </a:graphicData>
+            </a:graphic>
+          </wp:inline>
+        </w:drawing>
       </w:r>
     </w:p>
     <w:p>

</xml_diff>

<commit_message>
Add history browsing, trend summary, alert log, calibration and backup
Dashboard
- trend badges and a plain-language trend summary (direction + rate)
- history browser: paginated readings plus per-day aggregates

Backend
- new endpoints: /api/readings, /api/daily, /api/alerts, /api/calibration
- /api/latest now returns per-sensor trend deltas
- alert events recorded in an alerts table and alerts.csv
- per-sensor calibration offsets applied at ingestion
- automatic daily database backup (SQLite snapshot, keeps 14)

Spark / Hive
- demo and service-start scripts; ETL input/output paths configurable
- clear stale alert data left in HDFS by a previous run

Docs and tooling
- README: deployment, daily use, troubleshooting, demo steps
- demo scripts for backup and calibration; presentation script and PPT
</commit_message>
<xml_diff>
--- a/FYP Proposal P2321251Sun WenBin.docx
+++ b/FYP Proposal P2321251Sun WenBin.docx
@@ -318,7 +318,7 @@
                 <w:szCs w:val="28"/>
                 <w:lang w:val="en-GB"/>
               </w:rPr>
-              <w:t xml:space="preserve">A Low-Cost IoT Environmental Monitoring System for Server Rooms Using Raspberry Pi and DHT22 Sensors </w:t>
+              <w:t>An IoT Environmental Monitoring System with Real-Time Alerting and Spark-Based Distributed Batch Analytics for Server Rooms</w:t>
             </w:r>
           </w:p>
         </w:tc>
@@ -466,15 +466,23 @@
           <w:p>
             <w:pPr>
               <w:pStyle w:val="NoSpacing"/>
-            </w:pPr>
-            <w:r>
-              <w:t xml:space="preserve">Your </w:t>
-            </w:r>
-            <w:r>
-              <w:t>project</w:t>
-            </w:r>
-            <w:r>
-              <w:t xml:space="preserve"> number</w:t>
+              <w:rPr>
+                <w:lang w:eastAsia="zh-TW"/>
+              </w:rPr>
+            </w:pPr>
+            <w:r>
+              <w:rPr>
+                <w:rFonts w:eastAsiaTheme="minorEastAsia" w:hint="eastAsia"/>
+                <w:lang w:eastAsia="zh-CN"/>
+              </w:rPr>
+              <w:t>8</w:t>
+            </w:r>
+            <w:r>
+              <w:rPr>
+                <w:rFonts w:hint="eastAsia"/>
+                <w:lang w:eastAsia="zh-TW"/>
+              </w:rPr>
+              <w:t>1</w:t>
             </w:r>
           </w:p>
         </w:tc>
@@ -718,7 +726,21 @@
               <w:pStyle w:val="NoSpacing"/>
             </w:pPr>
             <w:r>
-              <w:t>XXX XX, 202</w:t>
+              <w:rPr>
+                <w:rFonts w:eastAsiaTheme="minorEastAsia" w:hint="eastAsia"/>
+                <w:lang w:eastAsia="zh-CN"/>
+              </w:rPr>
+              <w:t>Sep 10</w:t>
+            </w:r>
+            <w:r>
+              <w:rPr>
+                <w:rFonts w:eastAsiaTheme="minorEastAsia" w:hint="eastAsia"/>
+                <w:lang w:eastAsia="zh-CN"/>
+              </w:rPr>
+              <w:t xml:space="preserve"> </w:t>
+            </w:r>
+            <w:r>
+              <w:t>, 202</w:t>
             </w:r>
             <w:r>
               <w:t>6</w:t>
@@ -943,33 +965,25 @@
       </w:pPr>
       <w:r>
         <w:rPr>
-          <w:i/>
-          <w:sz w:val="23"/>
+          <w:noProof/>
         </w:rPr>
-        <w:t>Figure: Overall data flow from sensors to the frontend dashboard.</w:t>
-      </w:r>
-    </w:p>
-    <w:p>
-      <w:pPr>
-        <w:jc w:val="center"/>
-      </w:pPr>
-      <w:r>
         <w:drawing>
-          <wp:inline xmlns:a="http://schemas.openxmlformats.org/drawingml/2006/main" xmlns:pic="http://schemas.openxmlformats.org/drawingml/2006/picture">
-            <wp:extent cx="5400000" cy="3113265"/>
+          <wp:inline distT="0" distB="0" distL="0" distR="0" wp14:anchorId="2AC2763B" wp14:editId="013E895C">
+            <wp:extent cx="5400000" cy="1763265"/>
+            <wp:effectExtent l="0" t="0" r="0" b="0"/>
             <wp:docPr id="2" name="Picture 2"/>
             <wp:cNvGraphicFramePr>
-              <a:graphicFrameLocks noChangeAspect="1"/>
+              <a:graphicFrameLocks xmlns:a="http://schemas.openxmlformats.org/drawingml/2006/main" noChangeAspect="1"/>
             </wp:cNvGraphicFramePr>
-            <a:graphic>
+            <a:graphic xmlns:a="http://schemas.openxmlformats.org/drawingml/2006/main">
               <a:graphicData uri="http://schemas.openxmlformats.org/drawingml/2006/picture">
-                <pic:pic>
+                <pic:pic xmlns:pic="http://schemas.openxmlformats.org/drawingml/2006/picture">
                   <pic:nvPicPr>
-                    <pic:cNvPr id="0" name="diagram.png"/>
+                    <pic:cNvPr id="0" name="logic_design.png"/>
                     <pic:cNvPicPr/>
                   </pic:nvPicPr>
                   <pic:blipFill>
-                    <a:blip r:embed="rId19"/>
+                    <a:blip r:embed="rId15"/>
                     <a:stretch>
                       <a:fillRect/>
                     </a:stretch>
@@ -977,9 +991,11 @@
                   <pic:spPr>
                     <a:xfrm>
                       <a:off x="0" y="0"/>
-                      <a:ext cx="5400000" cy="3113265"/>
+                      <a:ext cx="5400000" cy="1763265"/>
                     </a:xfrm>
-                    <a:prstGeom prst="rect"/>
+                    <a:prstGeom prst="rect">
+                      <a:avLst/>
+                    </a:prstGeom>
                   </pic:spPr>
                 </pic:pic>
               </a:graphicData>
@@ -990,6 +1006,18 @@
     </w:p>
     <w:p>
       <w:pPr>
+        <w:jc w:val="center"/>
+      </w:pPr>
+      <w:r>
+        <w:rPr>
+          <w:i/>
+          <w:sz w:val="23"/>
+        </w:rPr>
+        <w:t>Figure: Logical design of the environmental monitoring system.</w:t>
+      </w:r>
+    </w:p>
+    <w:p>
+      <w:pPr>
         <w:pStyle w:val="Heading1"/>
       </w:pPr>
       <w:bookmarkStart w:id="5" w:name="_Toc453937401"/>
@@ -1006,17 +1034,14 @@
     <w:p/>
     <w:p>
       <w:r>
+        <w:lastRenderedPageBreak/>
         <w:t>On the low-cost side, the Internet of Things has made embedded sensing widely accessible: Gubbi et al. describe the vision and architectural elements of IoT systems in which low-power devices such as the Raspberry Pi collect and forward physical measurements [3]. Many open hardware projects combine a Raspberry Pi with a DHT22 sensor to log temperature and humidity, using the sensor datasheet as the reference for accuracy and timing requirements [1][2].</w:t>
       </w:r>
     </w:p>
     <w:p/>
     <w:p>
       <w:r>
-        <w:t xml:space="preserve">On the software side, lightweight REST back-ends built with Flask [7] and embedded relational storage such as SQLite [8] are common choices for small telemetry services because they add </w:t>
-      </w:r>
-      <w:r>
-        <w:lastRenderedPageBreak/>
-        <w:t>little overhead while providing fast, indexed queries. Interactive dashboards are typically rendered in the browser with Chart.js [5], and instant notifications can be delivered through the Telegram Bot API at low cost and with minimal setup [6]. For longer-term analysis, batch processing frameworks such as Apache Spark and the Hive warehouse [9][10] can aggregate large histories of readings efficiently.</w:t>
+        <w:t>On the software side, lightweight REST back-ends built with Flask [7] and embedded relational storage such as SQLite [8] are common choices for small telemetry services because they add little overhead while providing fast, indexed queries. Interactive dashboards are typically rendered in the browser with Chart.js [5], and instant notifications can be delivered through the Telegram Bot API at low cost and with minimal setup [6]. For longer-term analysis, batch processing frameworks such as Apache Spark and the Hive warehouse [9][10] can aggregate large histories of readings efficiently.</w:t>
       </w:r>
     </w:p>
     <w:p/>
@@ -1179,6 +1204,7 @@
           </w:tcPr>
           <w:p>
             <w:r>
+              <w:lastRenderedPageBreak/>
               <w:t>A2</w:t>
             </w:r>
           </w:p>
@@ -1315,11 +1341,7 @@
           </w:tcPr>
           <w:p>
             <w:r>
-              <w:t xml:space="preserve">Backend development: Flask ingestion API, SQLite persistence, threshold checking, </w:t>
-            </w:r>
-            <w:r>
-              <w:lastRenderedPageBreak/>
-              <w:t>Telegram alerts</w:t>
+              <w:t>Backend development: Flask ingestion API, SQLite persistence, threshold checking, Telegram alerts</w:t>
             </w:r>
           </w:p>
         </w:tc>
@@ -1329,7 +1351,6 @@
           </w:tcPr>
           <w:p>
             <w:r>
-              <w:lastRenderedPageBreak/>
               <w:t>4 wks (W9-12)</w:t>
             </w:r>
           </w:p>
@@ -1508,7 +1529,7 @@
           </w:tcPr>
           <w:p>
             <w:r>
-              <w:t>A7, A8</w:t>
+              <w:t>A7</w:t>
             </w:r>
           </w:p>
         </w:tc>
@@ -1688,6 +1709,7 @@
           </w:tcPr>
           <w:p>
             <w:r>
+              <w:lastRenderedPageBreak/>
               <w:t>A14</w:t>
             </w:r>
           </w:p>
@@ -1759,7 +1781,6 @@
       </w:pPr>
       <w:bookmarkStart w:id="7" w:name="_Toc453937403"/>
       <w:r>
-        <w:lastRenderedPageBreak/>
         <w:t>Risk Assessment</w:t>
       </w:r>
       <w:bookmarkEnd w:id="7"/>
@@ -2027,7 +2048,6 @@
         <w:rPr>
           <w:b/>
         </w:rPr>
-        <w:lastRenderedPageBreak/>
         <w:t xml:space="preserve">Description: </w:t>
       </w:r>
       <w:r>
@@ -2172,7 +2192,7 @@
     <w:p>
       <w:pPr>
         <w:rPr>
-          <w:rFonts w:eastAsiaTheme="minorEastAsia" w:hint="eastAsia"/>
+          <w:rFonts w:eastAsiaTheme="minorEastAsia"/>
           <w:lang w:eastAsia="zh-CN"/>
         </w:rPr>
       </w:pPr>
@@ -2250,6 +2270,7 @@
           </w:tcPr>
           <w:p>
             <w:r>
+              <w:lastRenderedPageBreak/>
               <w:t>2</w:t>
             </w:r>
           </w:p>
@@ -2412,7 +2433,6 @@
                 <w:b/>
                 <w:lang w:eastAsia="zh-CN"/>
               </w:rPr>
-              <w:lastRenderedPageBreak/>
               <w:t>Probability</w:t>
             </w:r>
           </w:p>
@@ -2589,7 +2609,7 @@
           <w:p>
             <w:pPr>
               <w:rPr>
-                <w:rFonts w:eastAsiaTheme="minorEastAsia" w:hint="eastAsia"/>
+                <w:rFonts w:eastAsiaTheme="minorEastAsia"/>
                 <w:lang w:eastAsia="zh-CN"/>
               </w:rPr>
             </w:pPr>
@@ -2658,7 +2678,7 @@
               <w:ind w:left="-360"/>
               <w:jc w:val="right"/>
               <w:rPr>
-                <w:rFonts w:eastAsiaTheme="minorEastAsia" w:hint="eastAsia"/>
+                <w:rFonts w:eastAsiaTheme="minorEastAsia"/>
                 <w:lang w:eastAsia="zh-CN"/>
               </w:rPr>
             </w:pPr>
@@ -2682,13 +2702,12 @@
           <w:p>
             <w:pPr>
               <w:tabs>
-                <w:tab w:val="left" w:pos="250"/>
+                <w:tab w:val="left" w:pos="30"/>
               </w:tabs>
               <w:ind w:left="-360"/>
               <w:rPr>
                 <w:rFonts w:eastAsiaTheme="minorEastAsia"/>
-                <w:sz w:val="15"/>
-                <w:szCs w:val="15"/>
+                <w:szCs w:val="22"/>
                 <w:lang w:eastAsia="zh-CN"/>
               </w:rPr>
             </w:pPr>
@@ -2702,8 +2721,7 @@
             <w:r>
               <w:rPr>
                 <w:rFonts w:eastAsiaTheme="minorEastAsia" w:hint="eastAsia"/>
-                <w:sz w:val="15"/>
-                <w:szCs w:val="15"/>
+                <w:szCs w:val="22"/>
                 <w:lang w:eastAsia="zh-CN"/>
               </w:rPr>
               <w:t>Risk3</w:t>
@@ -2718,8 +2736,7 @@
               <w:jc w:val="center"/>
               <w:rPr>
                 <w:rFonts w:eastAsiaTheme="minorEastAsia"/>
-                <w:sz w:val="15"/>
-                <w:szCs w:val="15"/>
+                <w:szCs w:val="22"/>
                 <w:lang w:eastAsia="zh-CN"/>
               </w:rPr>
             </w:pPr>
@@ -2730,7 +2747,24 @@
                 <w:szCs w:val="15"/>
                 <w:lang w:eastAsia="zh-CN"/>
               </w:rPr>
-              <w:t xml:space="preserve">            Risk4</w:t>
+              <w:t xml:space="preserve">   </w:t>
+            </w:r>
+            <w:r>
+              <w:rPr>
+                <w:rFonts w:eastAsiaTheme="minorEastAsia" w:hint="eastAsia"/>
+                <w:sz w:val="15"/>
+                <w:szCs w:val="15"/>
+                <w:lang w:eastAsia="zh-CN"/>
+              </w:rPr>
+              <w:t xml:space="preserve"> </w:t>
+            </w:r>
+            <w:r>
+              <w:rPr>
+                <w:rFonts w:eastAsiaTheme="minorEastAsia" w:hint="eastAsia"/>
+                <w:szCs w:val="22"/>
+                <w:lang w:eastAsia="zh-CN"/>
+              </w:rPr>
+              <w:t>Risk4</w:t>
             </w:r>
           </w:p>
           <w:p>
@@ -2741,12 +2775,20 @@
               <w:ind w:left="-360"/>
               <w:jc w:val="center"/>
               <w:rPr>
+                <w:rFonts w:eastAsiaTheme="minorEastAsia"/>
+                <w:szCs w:val="22"/>
+                <w:lang w:eastAsia="zh-CN"/>
+              </w:rPr>
+            </w:pPr>
+            <w:r>
+              <w:rPr>
                 <w:rFonts w:eastAsiaTheme="minorEastAsia" w:hint="eastAsia"/>
                 <w:sz w:val="15"/>
                 <w:szCs w:val="15"/>
                 <w:lang w:eastAsia="zh-CN"/>
               </w:rPr>
-            </w:pPr>
+              <w:t xml:space="preserve">   </w:t>
+            </w:r>
             <w:r>
               <w:rPr>
                 <w:rFonts w:eastAsiaTheme="minorEastAsia" w:hint="eastAsia"/>
@@ -2754,7 +2796,15 @@
                 <w:szCs w:val="15"/>
                 <w:lang w:eastAsia="zh-CN"/>
               </w:rPr>
-              <w:t xml:space="preserve">           Risk5</w:t>
+              <w:t xml:space="preserve"> </w:t>
+            </w:r>
+            <w:r>
+              <w:rPr>
+                <w:rFonts w:eastAsiaTheme="minorEastAsia" w:hint="eastAsia"/>
+                <w:szCs w:val="22"/>
+                <w:lang w:eastAsia="zh-CN"/>
+              </w:rPr>
+              <w:t>Risk5</w:t>
             </w:r>
           </w:p>
         </w:tc>
@@ -2771,8 +2821,7 @@
               <w:jc w:val="center"/>
               <w:rPr>
                 <w:rFonts w:eastAsiaTheme="minorEastAsia"/>
-                <w:sz w:val="15"/>
-                <w:szCs w:val="15"/>
+                <w:szCs w:val="22"/>
                 <w:lang w:eastAsia="zh-CN"/>
               </w:rPr>
             </w:pPr>
@@ -2783,8 +2832,39 @@
                 <w:szCs w:val="15"/>
                 <w:lang w:eastAsia="zh-CN"/>
               </w:rPr>
-              <w:t xml:space="preserve">        </w:t>
-            </w:r>
+              <w:t xml:space="preserve">       </w:t>
+            </w:r>
+            <w:r>
+              <w:rPr>
+                <w:rFonts w:eastAsiaTheme="minorEastAsia" w:hint="eastAsia"/>
+                <w:szCs w:val="22"/>
+                <w:lang w:eastAsia="zh-CN"/>
+              </w:rPr>
+              <w:t xml:space="preserve"> Risk1</w:t>
+            </w:r>
+          </w:p>
+          <w:p>
+            <w:pPr>
+              <w:ind w:left="-360"/>
+              <w:jc w:val="center"/>
+              <w:rPr>
+                <w:rFonts w:eastAsiaTheme="minorEastAsia"/>
+                <w:sz w:val="15"/>
+                <w:szCs w:val="15"/>
+                <w:lang w:eastAsia="zh-CN"/>
+              </w:rPr>
+            </w:pPr>
+          </w:p>
+          <w:p>
+            <w:pPr>
+              <w:ind w:left="-360"/>
+              <w:jc w:val="center"/>
+              <w:rPr>
+                <w:rFonts w:eastAsiaTheme="minorEastAsia"/>
+                <w:szCs w:val="22"/>
+                <w:lang w:eastAsia="zh-CN"/>
+              </w:rPr>
+            </w:pPr>
             <w:r>
               <w:rPr>
                 <w:rFonts w:eastAsiaTheme="minorEastAsia" w:hint="eastAsia"/>
@@ -2792,40 +2872,24 @@
                 <w:szCs w:val="15"/>
                 <w:lang w:eastAsia="zh-CN"/>
               </w:rPr>
-              <w:t>Risk1</w:t>
-            </w:r>
-          </w:p>
-          <w:p>
-            <w:pPr>
-              <w:ind w:left="-360"/>
-              <w:jc w:val="center"/>
-              <w:rPr>
-                <w:rFonts w:eastAsiaTheme="minorEastAsia"/>
-                <w:sz w:val="15"/>
-                <w:szCs w:val="15"/>
-                <w:lang w:eastAsia="zh-CN"/>
-              </w:rPr>
-            </w:pPr>
-          </w:p>
-          <w:p>
-            <w:pPr>
-              <w:ind w:left="-360"/>
-              <w:jc w:val="center"/>
+              <w:t xml:space="preserve">      </w:t>
+            </w:r>
+            <w:r>
               <w:rPr>
                 <w:rFonts w:eastAsiaTheme="minorEastAsia" w:hint="eastAsia"/>
                 <w:sz w:val="15"/>
                 <w:szCs w:val="15"/>
                 <w:lang w:eastAsia="zh-CN"/>
               </w:rPr>
-            </w:pPr>
+              <w:t xml:space="preserve"> </w:t>
+            </w:r>
             <w:r>
               <w:rPr>
                 <w:rFonts w:eastAsiaTheme="minorEastAsia" w:hint="eastAsia"/>
-                <w:sz w:val="15"/>
-                <w:szCs w:val="15"/>
+                <w:szCs w:val="22"/>
                 <w:lang w:eastAsia="zh-CN"/>
               </w:rPr>
-              <w:t xml:space="preserve">        Risk2</w:t>
+              <w:t>Risk2</w:t>
             </w:r>
           </w:p>
         </w:tc>
@@ -3073,7 +3137,7 @@
     <w:p>
       <w:pPr>
         <w:rPr>
-          <w:rFonts w:eastAsiaTheme="minorEastAsia" w:hint="eastAsia"/>
+          <w:rFonts w:eastAsiaTheme="minorEastAsia"/>
           <w:lang w:eastAsia="zh-CN"/>
         </w:rPr>
       </w:pPr>
@@ -3136,6 +3200,7 @@
         </w:rPr>
       </w:pPr>
       <w:r>
+        <w:lastRenderedPageBreak/>
         <w:t xml:space="preserve">[3] J. Gubbi, R. </w:t>
       </w:r>
       <w:proofErr w:type="spellStart"/>
@@ -3239,7 +3304,7 @@
       <w:pPr>
         <w:pStyle w:val="BibItems"/>
         <w:rPr>
-          <w:rFonts w:eastAsiaTheme="minorEastAsia" w:hint="eastAsia"/>
+          <w:rFonts w:eastAsiaTheme="minorEastAsia"/>
           <w:lang w:eastAsia="zh-CN"/>
         </w:rPr>
       </w:pPr>
@@ -3255,7 +3320,6 @@
         <w:pStyle w:val="Heading1withoutnumbering"/>
       </w:pPr>
       <w:r>
-        <w:lastRenderedPageBreak/>
         <w:t>Ethics Checklist</w:t>
       </w:r>
       <w:bookmarkEnd w:id="9"/>
@@ -3648,6 +3712,7 @@
         <w:rPr>
           <w:b/>
         </w:rPr>
+        <w:lastRenderedPageBreak/>
         <w:t>Project summary</w:t>
       </w:r>
     </w:p>
@@ -4836,331 +4901,81 @@
       </w:tr>
     </w:tbl>
     <w:p/>
-    <w:p/>
-    <w:tbl>
-      <w:tblPr>
-        <w:tblStyle w:val="TableGrid"/>
-        <w:tblW w:w="0" w:type="auto"/>
-        <w:tblLook w:val="04A0" w:firstRow="1" w:lastRow="0" w:firstColumn="1" w:lastColumn="0" w:noHBand="0" w:noVBand="1"/>
-      </w:tblPr>
-      <w:tblGrid>
-        <w:gridCol w:w="9243"/>
-      </w:tblGrid>
-      <w:tr>
-        <w:trPr>
-          <w:trHeight w:val="5750"/>
-        </w:trPr>
-        <w:tc>
-          <w:tcPr>
-            <w:tcW w:w="9350" w:type="dxa"/>
-          </w:tcPr>
-          <w:p>
-            <w:pPr>
-              <w:pStyle w:val="NoSpacing"/>
-            </w:pPr>
-            <w:r>
-              <w:rPr>
-                <w:lang w:val="en-GB"/>
-              </w:rPr>
-              <w:lastRenderedPageBreak/>
-              <w:t>No ethical issues are identified. The project monitors only physical environmental variables (temperature and humidity) in a server room. It involves no human participants, no personal or anonym sable data, and no activities that pose risks beyond ordinary study or working life.</w:t>
-            </w:r>
-          </w:p>
-          <w:p>
-            <w:pPr>
-              <w:pStyle w:val="NoSpacing"/>
-            </w:pPr>
-          </w:p>
-          <w:p>
-            <w:pPr>
-              <w:pStyle w:val="NoSpacing"/>
-            </w:pPr>
-          </w:p>
-          <w:p>
-            <w:pPr>
-              <w:pStyle w:val="NoSpacing"/>
-            </w:pPr>
-          </w:p>
-          <w:p>
-            <w:pPr>
-              <w:pStyle w:val="NoSpacing"/>
-            </w:pPr>
-          </w:p>
-        </w:tc>
-      </w:tr>
-      <w:tr>
-        <w:trPr>
-          <w:trHeight w:val="2240"/>
-        </w:trPr>
-        <w:tc>
-          <w:tcPr>
-            <w:tcW w:w="9350" w:type="dxa"/>
-          </w:tcPr>
-          <w:p>
-            <w:pPr>
-              <w:pStyle w:val="NoSpacing"/>
-            </w:pPr>
-            <w:r>
-              <w:t>Any other issues?</w:t>
-            </w:r>
-          </w:p>
-        </w:tc>
-      </w:tr>
-    </w:tbl>
-    <w:p/>
     <w:p>
       <w:pPr>
         <w:rPr>
-          <w:b/>
-        </w:rPr>
-      </w:pPr>
-      <w:r>
-        <w:rPr>
-          <w:b/>
-        </w:rPr>
-        <w:t>D</w:t>
-      </w:r>
-      <w:r>
-        <w:rPr>
-          <w:b/>
-        </w:rPr>
-        <w:t>eclaration</w:t>
-      </w:r>
-    </w:p>
-    <w:tbl>
-      <w:tblPr>
-        <w:tblStyle w:val="TableGrid"/>
-        <w:tblW w:w="0" w:type="auto"/>
-        <w:tblLook w:val="04A0" w:firstRow="1" w:lastRow="0" w:firstColumn="1" w:lastColumn="0" w:noHBand="0" w:noVBand="1"/>
-      </w:tblPr>
-      <w:tblGrid>
-        <w:gridCol w:w="4621"/>
-        <w:gridCol w:w="4622"/>
-      </w:tblGrid>
-      <w:tr>
-        <w:tc>
-          <w:tcPr>
-            <w:tcW w:w="4675" w:type="dxa"/>
-          </w:tcPr>
-          <w:p>
-            <w:pPr>
-              <w:pStyle w:val="NoSpacing"/>
-              <w:rPr>
-                <w:b/>
-                <w:bCs/>
-              </w:rPr>
-            </w:pPr>
-            <w:r>
-              <w:rPr>
-                <w:b/>
-                <w:bCs/>
-              </w:rPr>
-              <w:t>Student</w:t>
-            </w:r>
-          </w:p>
-          <w:p>
-            <w:pPr>
-              <w:pStyle w:val="NoSpacing"/>
-            </w:pPr>
-          </w:p>
-          <w:p>
-            <w:pPr>
-              <w:pStyle w:val="NoSpacing"/>
-            </w:pPr>
-            <w:r>
-              <w:t>I have read the instruction carefully and reported honestly the potential ethics issues about the project.</w:t>
-            </w:r>
-          </w:p>
-          <w:p>
-            <w:pPr>
-              <w:pStyle w:val="NoSpacing"/>
-            </w:pPr>
-          </w:p>
-          <w:p>
-            <w:pPr>
-              <w:pStyle w:val="NoSpacing"/>
-            </w:pPr>
-          </w:p>
-          <w:p>
-            <w:pPr>
-              <w:pStyle w:val="NoSpacing"/>
-            </w:pPr>
-          </w:p>
-          <w:p>
-            <w:pPr>
-              <w:pStyle w:val="NoSpacing"/>
-              <w:rPr>
-                <w:rFonts w:eastAsiaTheme="minorEastAsia"/>
-                <w:lang w:eastAsia="zh-CN"/>
-              </w:rPr>
-            </w:pPr>
-            <w:r>
-              <w:rPr>
-                <w:rFonts w:eastAsiaTheme="minorEastAsia" w:hint="eastAsia"/>
-                <w:lang w:eastAsia="zh-CN"/>
-              </w:rPr>
-              <w:t xml:space="preserve">Sun </w:t>
-            </w:r>
-            <w:proofErr w:type="spellStart"/>
-            <w:r>
-              <w:rPr>
-                <w:rFonts w:eastAsiaTheme="minorEastAsia" w:hint="eastAsia"/>
-                <w:lang w:eastAsia="zh-CN"/>
-              </w:rPr>
-              <w:t>WenBin</w:t>
-            </w:r>
-            <w:proofErr w:type="spellEnd"/>
-          </w:p>
-          <w:p>
-            <w:pPr>
-              <w:pStyle w:val="NoSpacing"/>
-            </w:pPr>
-            <w:r>
-              <w:rPr>
-                <w:rFonts w:hint="eastAsia"/>
-              </w:rPr>
-              <w:t>─────────────</w:t>
-            </w:r>
-          </w:p>
-          <w:p>
-            <w:pPr>
-              <w:pStyle w:val="NoSpacing"/>
-            </w:pPr>
-            <w:r>
-              <w:t>Date:</w:t>
-            </w:r>
-          </w:p>
-        </w:tc>
-        <w:tc>
-          <w:tcPr>
-            <w:tcW w:w="4675" w:type="dxa"/>
-          </w:tcPr>
-          <w:p>
-            <w:pPr>
-              <w:pStyle w:val="NoSpacing"/>
-              <w:rPr>
-                <w:b/>
-                <w:bCs/>
-              </w:rPr>
-            </w:pPr>
-            <w:r>
-              <w:rPr>
-                <w:b/>
-                <w:bCs/>
-              </w:rPr>
-              <w:t>Supervisor</w:t>
-            </w:r>
-          </w:p>
-          <w:p>
-            <w:pPr>
-              <w:pStyle w:val="NoSpacing"/>
-            </w:pPr>
-          </w:p>
-          <w:p>
-            <w:pPr>
-              <w:pStyle w:val="NoSpacing"/>
-            </w:pPr>
-            <w:r>
-              <w:t>To the best of my knowledge, the student has reported honestly the potential ethics issues about his/her project.</w:t>
-            </w:r>
-          </w:p>
-          <w:p>
-            <w:pPr>
-              <w:pStyle w:val="NoSpacing"/>
-            </w:pPr>
-          </w:p>
-          <w:p>
-            <w:pPr>
-              <w:pStyle w:val="NoSpacing"/>
-            </w:pPr>
-          </w:p>
-          <w:p>
-            <w:pPr>
-              <w:pStyle w:val="NoSpacing"/>
-            </w:pPr>
-          </w:p>
-          <w:p>
-            <w:pPr>
-              <w:pStyle w:val="NoSpacing"/>
-            </w:pPr>
-          </w:p>
-          <w:p>
-            <w:pPr>
-              <w:pStyle w:val="NoSpacing"/>
-            </w:pPr>
-            <w:r>
-              <w:rPr>
-                <w:rFonts w:hint="eastAsia"/>
-              </w:rPr>
-              <w:t>─────────────</w:t>
-            </w:r>
-          </w:p>
-          <w:p>
-            <w:pPr>
-              <w:pStyle w:val="NoSpacing"/>
-            </w:pPr>
-            <w:r>
-              <w:t>Date:</w:t>
-            </w:r>
-          </w:p>
-        </w:tc>
-      </w:tr>
-    </w:tbl>
-    <w:p>
-      <w:pPr>
-        <w:rPr>
-          <w:sz w:val="16"/>
-          <w:szCs w:val="16"/>
+          <w:lang w:eastAsia="zh-TW"/>
         </w:rPr>
       </w:pPr>
     </w:p>
     <w:p>
       <w:pPr>
         <w:rPr>
-          <w:sz w:val="18"/>
-          <w:szCs w:val="18"/>
+          <w:lang w:eastAsia="zh-TW"/>
         </w:rPr>
       </w:pPr>
-      <w:r>
+    </w:p>
+    <w:p>
+      <w:pPr>
         <w:rPr>
-          <w:sz w:val="16"/>
-          <w:szCs w:val="16"/>
+          <w:rFonts w:hint="eastAsia"/>
+          <w:lang w:eastAsia="zh-TW"/>
         </w:rPr>
-        <w:t xml:space="preserve">This form is largely based on the ethical approval documents from Cardiff University </w:t>
-      </w:r>
-      <w:hyperlink r:id="rId15" w:history="1">
-        <w:r>
-          <w:rPr>
-            <w:rStyle w:val="Hyperlink"/>
-            <w:sz w:val="16"/>
-            <w:szCs w:val="16"/>
-          </w:rPr>
-          <w:t>https://www.cs.cf.ac.uk/ethics/</w:t>
-        </w:r>
-      </w:hyperlink>
+      </w:pPr>
       <w:r>
         <w:rPr>
-          <w:sz w:val="16"/>
-          <w:szCs w:val="16"/>
+          <w:noProof/>
+          <w:lang w:eastAsia="zh-TW"/>
         </w:rPr>
-        <w:t xml:space="preserve"> and University of Glasgow </w:t>
-      </w:r>
-      <w:hyperlink r:id="rId16" w:history="1">
-        <w:r>
-          <w:rPr>
-            <w:rStyle w:val="Hyperlink"/>
-            <w:sz w:val="16"/>
-            <w:szCs w:val="16"/>
-          </w:rPr>
-          <w:t>http://www.dcs.gla.ac.uk/ethics/</w:t>
-        </w:r>
-      </w:hyperlink>
-      <w:r>
-        <w:rPr>
-          <w:sz w:val="16"/>
-          <w:szCs w:val="16"/>
-        </w:rPr>
-        <w:t xml:space="preserve"> </w:t>
+        <w:lastRenderedPageBreak/>
+        <w:drawing>
+          <wp:inline distT="0" distB="0" distL="0" distR="0" wp14:anchorId="70DB143A" wp14:editId="62593C84">
+            <wp:extent cx="5732145" cy="8068310"/>
+            <wp:effectExtent l="0" t="0" r="0" b="0"/>
+            <wp:docPr id="2069017200" name="Picture 3"/>
+            <wp:cNvGraphicFramePr>
+              <a:graphicFrameLocks xmlns:a="http://schemas.openxmlformats.org/drawingml/2006/main" noChangeAspect="1"/>
+            </wp:cNvGraphicFramePr>
+            <a:graphic xmlns:a="http://schemas.openxmlformats.org/drawingml/2006/main">
+              <a:graphicData uri="http://schemas.openxmlformats.org/drawingml/2006/picture">
+                <pic:pic xmlns:pic="http://schemas.openxmlformats.org/drawingml/2006/picture">
+                  <pic:nvPicPr>
+                    <pic:cNvPr id="0" name="Picture 3"/>
+                    <pic:cNvPicPr>
+                      <a:picLocks noChangeAspect="1" noChangeArrowheads="1"/>
+                    </pic:cNvPicPr>
+                  </pic:nvPicPr>
+                  <pic:blipFill>
+                    <a:blip r:embed="rId16">
+                      <a:extLst>
+                        <a:ext uri="{28A0092B-C50C-407E-A947-70E740481C1C}">
+                          <a14:useLocalDpi xmlns:a14="http://schemas.microsoft.com/office/drawing/2010/main" val="0"/>
+                        </a:ext>
+                      </a:extLst>
+                    </a:blip>
+                    <a:srcRect/>
+                    <a:stretch>
+                      <a:fillRect/>
+                    </a:stretch>
+                  </pic:blipFill>
+                  <pic:spPr bwMode="auto">
+                    <a:xfrm>
+                      <a:off x="0" y="0"/>
+                      <a:ext cx="5732145" cy="8068310"/>
+                    </a:xfrm>
+                    <a:prstGeom prst="rect">
+                      <a:avLst/>
+                    </a:prstGeom>
+                    <a:noFill/>
+                    <a:ln>
+                      <a:noFill/>
+                    </a:ln>
+                  </pic:spPr>
+                </pic:pic>
+              </a:graphicData>
+            </a:graphic>
+          </wp:inline>
+        </w:drawing>
       </w:r>
       <w:bookmarkEnd w:id="10"/>
       <w:bookmarkEnd w:id="11"/>

</xml_diff>